<commit_message>
Colour observation sheets: portrait layout, summary table, Oct/Nov
Co-Authored-By: Claude Opus 5.5 <noreply@anthropic.com>
Claude-Session: https://claude.ai/code/session_01RvXsjmA1DL5HHfNuUnQMYY
</commit_message>
<xml_diff>
--- a/Өнгө_таних_ажиглалт/11-р_сар_өнгө_таних_ажиглалт_2_нас.docx
+++ b/Өнгө_таних_ажиглалт/11-р_сар_өнгө_таних_ажиглалт_2_нас.docx
@@ -31,15 +31,15 @@
     </w:p>
     <w:p>
       <w:pPr>
-        <w:spacing w:after="80"/>
+        <w:spacing w:after="60"/>
         <w:jc w:val="left"/>
       </w:pPr>
       <w:r>
         <w:rPr>
           <w:b w:val="0"/>
-          <w:sz w:val="20"/>
+          <w:sz w:val="18"/>
         </w:rPr>
-        <w:t>Бүлэг: ____________________     Багшийн туслах: ______________________________     Багш: ______________________________</w:t>
+        <w:t>Бүлэг: ______________   Багшийн туслах: ______________________   Багш: ______________________</w:t>
       </w:r>
     </w:p>
     <w:tbl>
@@ -51,30 +51,29 @@
         <w:tblLook w:firstColumn="1" w:firstRow="1" w:lastColumn="0" w:lastRow="0" w:noHBand="0" w:noVBand="1" w:val="04A0"/>
       </w:tblPr>
       <w:tblGrid>
-        <w:gridCol w:w="454"/>
-        <w:gridCol w:w="2608"/>
-        <w:gridCol w:w="794"/>
-        <w:gridCol w:w="794"/>
-        <w:gridCol w:w="794"/>
-        <w:gridCol w:w="794"/>
-        <w:gridCol w:w="794"/>
-        <w:gridCol w:w="794"/>
-        <w:gridCol w:w="794"/>
-        <w:gridCol w:w="794"/>
-        <w:gridCol w:w="794"/>
-        <w:gridCol w:w="794"/>
-        <w:gridCol w:w="794"/>
-        <w:gridCol w:w="794"/>
-        <w:gridCol w:w="1814"/>
+        <w:gridCol w:w="397"/>
+        <w:gridCol w:w="2778"/>
+        <w:gridCol w:w="635"/>
+        <w:gridCol w:w="635"/>
+        <w:gridCol w:w="635"/>
+        <w:gridCol w:w="635"/>
+        <w:gridCol w:w="635"/>
+        <w:gridCol w:w="635"/>
+        <w:gridCol w:w="635"/>
+        <w:gridCol w:w="635"/>
+        <w:gridCol w:w="635"/>
+        <w:gridCol w:w="635"/>
+        <w:gridCol w:w="635"/>
+        <w:gridCol w:w="635"/>
       </w:tblGrid>
       <w:tr>
         <w:trPr>
-          <w:trHeight w:val="1247" w:hRule="atLeast"/>
+          <w:trHeight w:val="1134" w:hRule="atLeast"/>
           <w:tblHeader w:val="true"/>
         </w:trPr>
         <w:tc>
           <w:tcPr>
-            <w:tcW w:type="dxa" w:w="454"/>
+            <w:tcW w:type="dxa" w:w="397"/>
             <w:vMerge w:val="restart"/>
             <w:vAlign w:val="center"/>
             <w:shd w:val="clear" w:color="auto" w:fill="D9EAD3"/>
@@ -96,7 +95,7 @@
         </w:tc>
         <w:tc>
           <w:tcPr>
-            <w:tcW w:type="dxa" w:w="2608"/>
+            <w:tcW w:type="dxa" w:w="2778"/>
             <w:vMerge w:val="restart"/>
             <w:vAlign w:val="center"/>
             <w:shd w:val="clear" w:color="auto" w:fill="D9EAD3"/>
@@ -118,7 +117,7 @@
         </w:tc>
         <w:tc>
           <w:tcPr>
-            <w:tcW w:type="dxa" w:w="794"/>
+            <w:tcW w:type="dxa" w:w="635"/>
             <w:gridSpan w:val="3"/>
             <w:shd w:val="clear" w:color="auto" w:fill="FDE2E2"/>
             <w:vAlign w:val="center"/>
@@ -132,7 +131,7 @@
             <w:r>
               <w:drawing>
                 <wp:inline xmlns:a="http://schemas.openxmlformats.org/drawingml/2006/main" xmlns:pic="http://schemas.openxmlformats.org/drawingml/2006/picture">
-                  <wp:extent cx="558000" cy="558000"/>
+                  <wp:extent cx="486000" cy="486000"/>
                   <wp:docPr id="1" name="Picture 1"/>
                   <wp:cNvGraphicFramePr>
                     <a:graphicFrameLocks noChangeAspect="1"/>
@@ -153,7 +152,7 @@
                         <pic:spPr>
                           <a:xfrm>
                             <a:off x="0" y="0"/>
-                            <a:ext cx="558000" cy="558000"/>
+                            <a:ext cx="486000" cy="486000"/>
                           </a:xfrm>
                           <a:prstGeom prst="rect"/>
                         </pic:spPr>
@@ -180,7 +179,7 @@
         </w:tc>
         <w:tc>
           <w:tcPr>
-            <w:tcW w:type="dxa" w:w="794"/>
+            <w:tcW w:type="dxa" w:w="635"/>
             <w:gridSpan w:val="3"/>
             <w:shd w:val="clear" w:color="auto" w:fill="FEF6D0"/>
             <w:vAlign w:val="center"/>
@@ -194,7 +193,7 @@
             <w:r>
               <w:drawing>
                 <wp:inline xmlns:a="http://schemas.openxmlformats.org/drawingml/2006/main" xmlns:pic="http://schemas.openxmlformats.org/drawingml/2006/picture">
-                  <wp:extent cx="558000" cy="558000"/>
+                  <wp:extent cx="486000" cy="486000"/>
                   <wp:docPr id="2" name="Picture 2"/>
                   <wp:cNvGraphicFramePr>
                     <a:graphicFrameLocks noChangeAspect="1"/>
@@ -215,7 +214,7 @@
                         <pic:spPr>
                           <a:xfrm>
                             <a:off x="0" y="0"/>
-                            <a:ext cx="558000" cy="558000"/>
+                            <a:ext cx="486000" cy="486000"/>
                           </a:xfrm>
                           <a:prstGeom prst="rect"/>
                         </pic:spPr>
@@ -242,7 +241,7 @@
         </w:tc>
         <w:tc>
           <w:tcPr>
-            <w:tcW w:type="dxa" w:w="794"/>
+            <w:tcW w:type="dxa" w:w="635"/>
             <w:gridSpan w:val="3"/>
             <w:shd w:val="clear" w:color="auto" w:fill="DCE7FD"/>
             <w:vAlign w:val="center"/>
@@ -256,7 +255,7 @@
             <w:r>
               <w:drawing>
                 <wp:inline xmlns:a="http://schemas.openxmlformats.org/drawingml/2006/main" xmlns:pic="http://schemas.openxmlformats.org/drawingml/2006/picture">
-                  <wp:extent cx="558000" cy="558000"/>
+                  <wp:extent cx="486000" cy="486000"/>
                   <wp:docPr id="3" name="Picture 3"/>
                   <wp:cNvGraphicFramePr>
                     <a:graphicFrameLocks noChangeAspect="1"/>
@@ -277,7 +276,7 @@
                         <pic:spPr>
                           <a:xfrm>
                             <a:off x="0" y="0"/>
-                            <a:ext cx="558000" cy="558000"/>
+                            <a:ext cx="486000" cy="486000"/>
                           </a:xfrm>
                           <a:prstGeom prst="rect"/>
                         </pic:spPr>
@@ -304,7 +303,7 @@
         </w:tc>
         <w:tc>
           <w:tcPr>
-            <w:tcW w:type="dxa" w:w="794"/>
+            <w:tcW w:type="dxa" w:w="635"/>
             <w:gridSpan w:val="3"/>
             <w:shd w:val="clear" w:color="auto" w:fill="DCF3E4"/>
             <w:vAlign w:val="center"/>
@@ -318,7 +317,7 @@
             <w:r>
               <w:drawing>
                 <wp:inline xmlns:a="http://schemas.openxmlformats.org/drawingml/2006/main" xmlns:pic="http://schemas.openxmlformats.org/drawingml/2006/picture">
-                  <wp:extent cx="558000" cy="558000"/>
+                  <wp:extent cx="486000" cy="486000"/>
                   <wp:docPr id="4" name="Picture 4"/>
                   <wp:cNvGraphicFramePr>
                     <a:graphicFrameLocks noChangeAspect="1"/>
@@ -339,7 +338,7 @@
                         <pic:spPr>
                           <a:xfrm>
                             <a:off x="0" y="0"/>
-                            <a:ext cx="558000" cy="558000"/>
+                            <a:ext cx="486000" cy="486000"/>
                           </a:xfrm>
                           <a:prstGeom prst="rect"/>
                         </pic:spPr>
@@ -364,28 +363,6 @@
             </w:r>
           </w:p>
         </w:tc>
-        <w:tc>
-          <w:tcPr>
-            <w:tcW w:type="dxa" w:w="1814"/>
-            <w:vMerge w:val="restart"/>
-            <w:vAlign w:val="center"/>
-            <w:shd w:val="clear" w:color="auto" w:fill="D9EAD3"/>
-          </w:tcPr>
-          <w:p>
-            <w:pPr>
-              <w:spacing w:after="0" w:before="0"/>
-              <w:jc w:val="center"/>
-            </w:pPr>
-            <w:r/>
-            <w:r>
-              <w:rPr>
-                <w:b/>
-                <w:sz w:val="20"/>
-              </w:rPr>
-              <w:t>Тэмдэглэл</w:t>
-            </w:r>
-          </w:p>
-        </w:tc>
       </w:tr>
       <w:tr>
         <w:trPr>
@@ -394,21 +371,21 @@
         </w:trPr>
         <w:tc>
           <w:tcPr>
-            <w:tcW w:type="dxa" w:w="1032"/>
+            <w:tcW w:type="dxa" w:w="769"/>
             <w:vMerge/>
           </w:tcPr>
           <w:p/>
         </w:tc>
         <w:tc>
           <w:tcPr>
-            <w:tcW w:type="dxa" w:w="1032"/>
+            <w:tcW w:type="dxa" w:w="769"/>
             <w:vMerge/>
           </w:tcPr>
           <w:p/>
         </w:tc>
         <w:tc>
           <w:tcPr>
-            <w:tcW w:type="dxa" w:w="794"/>
+            <w:tcW w:type="dxa" w:w="635"/>
             <w:shd w:val="clear" w:color="auto" w:fill="FDE2E2"/>
             <w:vAlign w:val="center"/>
           </w:tcPr>
@@ -442,7 +419,7 @@
         </w:tc>
         <w:tc>
           <w:tcPr>
-            <w:tcW w:type="dxa" w:w="794"/>
+            <w:tcW w:type="dxa" w:w="635"/>
             <w:shd w:val="clear" w:color="auto" w:fill="FDE2E2"/>
             <w:vAlign w:val="center"/>
           </w:tcPr>
@@ -476,7 +453,7 @@
         </w:tc>
         <w:tc>
           <w:tcPr>
-            <w:tcW w:type="dxa" w:w="794"/>
+            <w:tcW w:type="dxa" w:w="635"/>
             <w:shd w:val="clear" w:color="auto" w:fill="FDE2E2"/>
             <w:vAlign w:val="center"/>
           </w:tcPr>
@@ -510,7 +487,7 @@
         </w:tc>
         <w:tc>
           <w:tcPr>
-            <w:tcW w:type="dxa" w:w="794"/>
+            <w:tcW w:type="dxa" w:w="635"/>
             <w:shd w:val="clear" w:color="auto" w:fill="FEF6D0"/>
             <w:vAlign w:val="center"/>
           </w:tcPr>
@@ -544,7 +521,7 @@
         </w:tc>
         <w:tc>
           <w:tcPr>
-            <w:tcW w:type="dxa" w:w="794"/>
+            <w:tcW w:type="dxa" w:w="635"/>
             <w:shd w:val="clear" w:color="auto" w:fill="FEF6D0"/>
             <w:vAlign w:val="center"/>
           </w:tcPr>
@@ -578,7 +555,7 @@
         </w:tc>
         <w:tc>
           <w:tcPr>
-            <w:tcW w:type="dxa" w:w="794"/>
+            <w:tcW w:type="dxa" w:w="635"/>
             <w:shd w:val="clear" w:color="auto" w:fill="FEF6D0"/>
             <w:vAlign w:val="center"/>
           </w:tcPr>
@@ -612,7 +589,7 @@
         </w:tc>
         <w:tc>
           <w:tcPr>
-            <w:tcW w:type="dxa" w:w="794"/>
+            <w:tcW w:type="dxa" w:w="635"/>
             <w:shd w:val="clear" w:color="auto" w:fill="DCE7FD"/>
             <w:vAlign w:val="center"/>
           </w:tcPr>
@@ -646,7 +623,7 @@
         </w:tc>
         <w:tc>
           <w:tcPr>
-            <w:tcW w:type="dxa" w:w="794"/>
+            <w:tcW w:type="dxa" w:w="635"/>
             <w:shd w:val="clear" w:color="auto" w:fill="DCE7FD"/>
             <w:vAlign w:val="center"/>
           </w:tcPr>
@@ -680,7 +657,7 @@
         </w:tc>
         <w:tc>
           <w:tcPr>
-            <w:tcW w:type="dxa" w:w="794"/>
+            <w:tcW w:type="dxa" w:w="635"/>
             <w:shd w:val="clear" w:color="auto" w:fill="DCE7FD"/>
             <w:vAlign w:val="center"/>
           </w:tcPr>
@@ -714,7 +691,7 @@
         </w:tc>
         <w:tc>
           <w:tcPr>
-            <w:tcW w:type="dxa" w:w="794"/>
+            <w:tcW w:type="dxa" w:w="635"/>
             <w:shd w:val="clear" w:color="auto" w:fill="DCF3E4"/>
             <w:vAlign w:val="center"/>
           </w:tcPr>
@@ -748,7 +725,7 @@
         </w:tc>
         <w:tc>
           <w:tcPr>
-            <w:tcW w:type="dxa" w:w="794"/>
+            <w:tcW w:type="dxa" w:w="635"/>
             <w:shd w:val="clear" w:color="auto" w:fill="DCF3E4"/>
             <w:vAlign w:val="center"/>
           </w:tcPr>
@@ -782,7 +759,7 @@
         </w:tc>
         <w:tc>
           <w:tcPr>
-            <w:tcW w:type="dxa" w:w="794"/>
+            <w:tcW w:type="dxa" w:w="635"/>
             <w:shd w:val="clear" w:color="auto" w:fill="DCF3E4"/>
             <w:vAlign w:val="center"/>
           </w:tcPr>
@@ -814,21 +791,14 @@
             </w:r>
           </w:p>
         </w:tc>
-        <w:tc>
-          <w:tcPr>
-            <w:tcW w:type="dxa" w:w="1032"/>
-            <w:vMerge/>
-          </w:tcPr>
-          <w:p/>
-        </w:tc>
       </w:tr>
       <w:tr>
         <w:trPr>
-          <w:trHeight w:val="283" w:hRule="atLeast"/>
+          <w:trHeight w:val="295" w:hRule="atLeast"/>
         </w:trPr>
         <w:tc>
           <w:tcPr>
-            <w:tcW w:type="dxa" w:w="454"/>
+            <w:tcW w:type="dxa" w:w="397"/>
             <w:vAlign w:val="center"/>
           </w:tcPr>
           <w:p>
@@ -847,96 +817,90 @@
         </w:tc>
         <w:tc>
           <w:tcPr>
-            <w:tcW w:type="dxa" w:w="2608"/>
-          </w:tcPr>
-          <w:p/>
-        </w:tc>
-        <w:tc>
-          <w:tcPr>
-            <w:tcW w:type="dxa" w:w="794"/>
-          </w:tcPr>
-          <w:p/>
-        </w:tc>
-        <w:tc>
-          <w:tcPr>
-            <w:tcW w:type="dxa" w:w="794"/>
-          </w:tcPr>
-          <w:p/>
-        </w:tc>
-        <w:tc>
-          <w:tcPr>
-            <w:tcW w:type="dxa" w:w="794"/>
-          </w:tcPr>
-          <w:p/>
-        </w:tc>
-        <w:tc>
-          <w:tcPr>
-            <w:tcW w:type="dxa" w:w="794"/>
-          </w:tcPr>
-          <w:p/>
-        </w:tc>
-        <w:tc>
-          <w:tcPr>
-            <w:tcW w:type="dxa" w:w="794"/>
-          </w:tcPr>
-          <w:p/>
-        </w:tc>
-        <w:tc>
-          <w:tcPr>
-            <w:tcW w:type="dxa" w:w="794"/>
-          </w:tcPr>
-          <w:p/>
-        </w:tc>
-        <w:tc>
-          <w:tcPr>
-            <w:tcW w:type="dxa" w:w="794"/>
-          </w:tcPr>
-          <w:p/>
-        </w:tc>
-        <w:tc>
-          <w:tcPr>
-            <w:tcW w:type="dxa" w:w="794"/>
-          </w:tcPr>
-          <w:p/>
-        </w:tc>
-        <w:tc>
-          <w:tcPr>
-            <w:tcW w:type="dxa" w:w="794"/>
-          </w:tcPr>
-          <w:p/>
-        </w:tc>
-        <w:tc>
-          <w:tcPr>
-            <w:tcW w:type="dxa" w:w="794"/>
-          </w:tcPr>
-          <w:p/>
-        </w:tc>
-        <w:tc>
-          <w:tcPr>
-            <w:tcW w:type="dxa" w:w="794"/>
-          </w:tcPr>
-          <w:p/>
-        </w:tc>
-        <w:tc>
-          <w:tcPr>
-            <w:tcW w:type="dxa" w:w="794"/>
-          </w:tcPr>
-          <w:p/>
-        </w:tc>
-        <w:tc>
-          <w:tcPr>
-            <w:tcW w:type="dxa" w:w="1814"/>
+            <w:tcW w:type="dxa" w:w="2778"/>
+          </w:tcPr>
+          <w:p/>
+        </w:tc>
+        <w:tc>
+          <w:tcPr>
+            <w:tcW w:type="dxa" w:w="635"/>
+          </w:tcPr>
+          <w:p/>
+        </w:tc>
+        <w:tc>
+          <w:tcPr>
+            <w:tcW w:type="dxa" w:w="635"/>
+          </w:tcPr>
+          <w:p/>
+        </w:tc>
+        <w:tc>
+          <w:tcPr>
+            <w:tcW w:type="dxa" w:w="635"/>
+          </w:tcPr>
+          <w:p/>
+        </w:tc>
+        <w:tc>
+          <w:tcPr>
+            <w:tcW w:type="dxa" w:w="635"/>
+          </w:tcPr>
+          <w:p/>
+        </w:tc>
+        <w:tc>
+          <w:tcPr>
+            <w:tcW w:type="dxa" w:w="635"/>
+          </w:tcPr>
+          <w:p/>
+        </w:tc>
+        <w:tc>
+          <w:tcPr>
+            <w:tcW w:type="dxa" w:w="635"/>
+          </w:tcPr>
+          <w:p/>
+        </w:tc>
+        <w:tc>
+          <w:tcPr>
+            <w:tcW w:type="dxa" w:w="635"/>
+          </w:tcPr>
+          <w:p/>
+        </w:tc>
+        <w:tc>
+          <w:tcPr>
+            <w:tcW w:type="dxa" w:w="635"/>
+          </w:tcPr>
+          <w:p/>
+        </w:tc>
+        <w:tc>
+          <w:tcPr>
+            <w:tcW w:type="dxa" w:w="635"/>
+          </w:tcPr>
+          <w:p/>
+        </w:tc>
+        <w:tc>
+          <w:tcPr>
+            <w:tcW w:type="dxa" w:w="635"/>
+          </w:tcPr>
+          <w:p/>
+        </w:tc>
+        <w:tc>
+          <w:tcPr>
+            <w:tcW w:type="dxa" w:w="635"/>
+          </w:tcPr>
+          <w:p/>
+        </w:tc>
+        <w:tc>
+          <w:tcPr>
+            <w:tcW w:type="dxa" w:w="635"/>
           </w:tcPr>
           <w:p/>
         </w:tc>
       </w:tr>
       <w:tr>
         <w:trPr>
-          <w:trHeight w:val="283" w:hRule="atLeast"/>
+          <w:trHeight w:val="295" w:hRule="atLeast"/>
         </w:trPr>
         <w:tc>
           <w:tcPr>
-            <w:tcW w:type="dxa" w:w="454"/>
+            <w:tcW w:type="dxa" w:w="397"/>
             <w:vAlign w:val="center"/>
           </w:tcPr>
           <w:p>
@@ -955,108 +919,102 @@
         </w:tc>
         <w:tc>
           <w:tcPr>
-            <w:tcW w:type="dxa" w:w="2608"/>
-          </w:tcPr>
-          <w:p/>
-        </w:tc>
-        <w:tc>
-          <w:tcPr>
-            <w:tcW w:type="dxa" w:w="794"/>
+            <w:tcW w:type="dxa" w:w="2778"/>
+          </w:tcPr>
+          <w:p/>
+        </w:tc>
+        <w:tc>
+          <w:tcPr>
+            <w:tcW w:type="dxa" w:w="635"/>
             <w:shd w:val="clear" w:color="auto" w:fill="FDE2E2"/>
           </w:tcPr>
           <w:p/>
         </w:tc>
         <w:tc>
           <w:tcPr>
-            <w:tcW w:type="dxa" w:w="794"/>
+            <w:tcW w:type="dxa" w:w="635"/>
             <w:shd w:val="clear" w:color="auto" w:fill="FDE2E2"/>
           </w:tcPr>
           <w:p/>
         </w:tc>
         <w:tc>
           <w:tcPr>
-            <w:tcW w:type="dxa" w:w="794"/>
+            <w:tcW w:type="dxa" w:w="635"/>
             <w:shd w:val="clear" w:color="auto" w:fill="FDE2E2"/>
           </w:tcPr>
           <w:p/>
         </w:tc>
         <w:tc>
           <w:tcPr>
-            <w:tcW w:type="dxa" w:w="794"/>
+            <w:tcW w:type="dxa" w:w="635"/>
             <w:shd w:val="clear" w:color="auto" w:fill="FEF6D0"/>
           </w:tcPr>
           <w:p/>
         </w:tc>
         <w:tc>
           <w:tcPr>
-            <w:tcW w:type="dxa" w:w="794"/>
+            <w:tcW w:type="dxa" w:w="635"/>
             <w:shd w:val="clear" w:color="auto" w:fill="FEF6D0"/>
           </w:tcPr>
           <w:p/>
         </w:tc>
         <w:tc>
           <w:tcPr>
-            <w:tcW w:type="dxa" w:w="794"/>
+            <w:tcW w:type="dxa" w:w="635"/>
             <w:shd w:val="clear" w:color="auto" w:fill="FEF6D0"/>
           </w:tcPr>
           <w:p/>
         </w:tc>
         <w:tc>
           <w:tcPr>
-            <w:tcW w:type="dxa" w:w="794"/>
+            <w:tcW w:type="dxa" w:w="635"/>
             <w:shd w:val="clear" w:color="auto" w:fill="DCE7FD"/>
           </w:tcPr>
           <w:p/>
         </w:tc>
         <w:tc>
           <w:tcPr>
-            <w:tcW w:type="dxa" w:w="794"/>
+            <w:tcW w:type="dxa" w:w="635"/>
             <w:shd w:val="clear" w:color="auto" w:fill="DCE7FD"/>
           </w:tcPr>
           <w:p/>
         </w:tc>
         <w:tc>
           <w:tcPr>
-            <w:tcW w:type="dxa" w:w="794"/>
+            <w:tcW w:type="dxa" w:w="635"/>
             <w:shd w:val="clear" w:color="auto" w:fill="DCE7FD"/>
           </w:tcPr>
           <w:p/>
         </w:tc>
         <w:tc>
           <w:tcPr>
-            <w:tcW w:type="dxa" w:w="794"/>
+            <w:tcW w:type="dxa" w:w="635"/>
             <w:shd w:val="clear" w:color="auto" w:fill="DCF3E4"/>
           </w:tcPr>
           <w:p/>
         </w:tc>
         <w:tc>
           <w:tcPr>
-            <w:tcW w:type="dxa" w:w="794"/>
+            <w:tcW w:type="dxa" w:w="635"/>
             <w:shd w:val="clear" w:color="auto" w:fill="DCF3E4"/>
           </w:tcPr>
           <w:p/>
         </w:tc>
         <w:tc>
           <w:tcPr>
-            <w:tcW w:type="dxa" w:w="794"/>
+            <w:tcW w:type="dxa" w:w="635"/>
             <w:shd w:val="clear" w:color="auto" w:fill="DCF3E4"/>
-          </w:tcPr>
-          <w:p/>
-        </w:tc>
-        <w:tc>
-          <w:tcPr>
-            <w:tcW w:type="dxa" w:w="1814"/>
           </w:tcPr>
           <w:p/>
         </w:tc>
       </w:tr>
       <w:tr>
         <w:trPr>
-          <w:trHeight w:val="283" w:hRule="atLeast"/>
+          <w:trHeight w:val="295" w:hRule="atLeast"/>
         </w:trPr>
         <w:tc>
           <w:tcPr>
-            <w:tcW w:type="dxa" w:w="454"/>
+            <w:tcW w:type="dxa" w:w="397"/>
             <w:vAlign w:val="center"/>
           </w:tcPr>
           <w:p>
@@ -1075,96 +1033,90 @@
         </w:tc>
         <w:tc>
           <w:tcPr>
-            <w:tcW w:type="dxa" w:w="2608"/>
-          </w:tcPr>
-          <w:p/>
-        </w:tc>
-        <w:tc>
-          <w:tcPr>
-            <w:tcW w:type="dxa" w:w="794"/>
-          </w:tcPr>
-          <w:p/>
-        </w:tc>
-        <w:tc>
-          <w:tcPr>
-            <w:tcW w:type="dxa" w:w="794"/>
-          </w:tcPr>
-          <w:p/>
-        </w:tc>
-        <w:tc>
-          <w:tcPr>
-            <w:tcW w:type="dxa" w:w="794"/>
-          </w:tcPr>
-          <w:p/>
-        </w:tc>
-        <w:tc>
-          <w:tcPr>
-            <w:tcW w:type="dxa" w:w="794"/>
-          </w:tcPr>
-          <w:p/>
-        </w:tc>
-        <w:tc>
-          <w:tcPr>
-            <w:tcW w:type="dxa" w:w="794"/>
-          </w:tcPr>
-          <w:p/>
-        </w:tc>
-        <w:tc>
-          <w:tcPr>
-            <w:tcW w:type="dxa" w:w="794"/>
-          </w:tcPr>
-          <w:p/>
-        </w:tc>
-        <w:tc>
-          <w:tcPr>
-            <w:tcW w:type="dxa" w:w="794"/>
-          </w:tcPr>
-          <w:p/>
-        </w:tc>
-        <w:tc>
-          <w:tcPr>
-            <w:tcW w:type="dxa" w:w="794"/>
-          </w:tcPr>
-          <w:p/>
-        </w:tc>
-        <w:tc>
-          <w:tcPr>
-            <w:tcW w:type="dxa" w:w="794"/>
-          </w:tcPr>
-          <w:p/>
-        </w:tc>
-        <w:tc>
-          <w:tcPr>
-            <w:tcW w:type="dxa" w:w="794"/>
-          </w:tcPr>
-          <w:p/>
-        </w:tc>
-        <w:tc>
-          <w:tcPr>
-            <w:tcW w:type="dxa" w:w="794"/>
-          </w:tcPr>
-          <w:p/>
-        </w:tc>
-        <w:tc>
-          <w:tcPr>
-            <w:tcW w:type="dxa" w:w="794"/>
-          </w:tcPr>
-          <w:p/>
-        </w:tc>
-        <w:tc>
-          <w:tcPr>
-            <w:tcW w:type="dxa" w:w="1814"/>
+            <w:tcW w:type="dxa" w:w="2778"/>
+          </w:tcPr>
+          <w:p/>
+        </w:tc>
+        <w:tc>
+          <w:tcPr>
+            <w:tcW w:type="dxa" w:w="635"/>
+          </w:tcPr>
+          <w:p/>
+        </w:tc>
+        <w:tc>
+          <w:tcPr>
+            <w:tcW w:type="dxa" w:w="635"/>
+          </w:tcPr>
+          <w:p/>
+        </w:tc>
+        <w:tc>
+          <w:tcPr>
+            <w:tcW w:type="dxa" w:w="635"/>
+          </w:tcPr>
+          <w:p/>
+        </w:tc>
+        <w:tc>
+          <w:tcPr>
+            <w:tcW w:type="dxa" w:w="635"/>
+          </w:tcPr>
+          <w:p/>
+        </w:tc>
+        <w:tc>
+          <w:tcPr>
+            <w:tcW w:type="dxa" w:w="635"/>
+          </w:tcPr>
+          <w:p/>
+        </w:tc>
+        <w:tc>
+          <w:tcPr>
+            <w:tcW w:type="dxa" w:w="635"/>
+          </w:tcPr>
+          <w:p/>
+        </w:tc>
+        <w:tc>
+          <w:tcPr>
+            <w:tcW w:type="dxa" w:w="635"/>
+          </w:tcPr>
+          <w:p/>
+        </w:tc>
+        <w:tc>
+          <w:tcPr>
+            <w:tcW w:type="dxa" w:w="635"/>
+          </w:tcPr>
+          <w:p/>
+        </w:tc>
+        <w:tc>
+          <w:tcPr>
+            <w:tcW w:type="dxa" w:w="635"/>
+          </w:tcPr>
+          <w:p/>
+        </w:tc>
+        <w:tc>
+          <w:tcPr>
+            <w:tcW w:type="dxa" w:w="635"/>
+          </w:tcPr>
+          <w:p/>
+        </w:tc>
+        <w:tc>
+          <w:tcPr>
+            <w:tcW w:type="dxa" w:w="635"/>
+          </w:tcPr>
+          <w:p/>
+        </w:tc>
+        <w:tc>
+          <w:tcPr>
+            <w:tcW w:type="dxa" w:w="635"/>
           </w:tcPr>
           <w:p/>
         </w:tc>
       </w:tr>
       <w:tr>
         <w:trPr>
-          <w:trHeight w:val="283" w:hRule="atLeast"/>
+          <w:trHeight w:val="295" w:hRule="atLeast"/>
         </w:trPr>
         <w:tc>
           <w:tcPr>
-            <w:tcW w:type="dxa" w:w="454"/>
+            <w:tcW w:type="dxa" w:w="397"/>
             <w:vAlign w:val="center"/>
           </w:tcPr>
           <w:p>
@@ -1183,108 +1135,102 @@
         </w:tc>
         <w:tc>
           <w:tcPr>
-            <w:tcW w:type="dxa" w:w="2608"/>
-          </w:tcPr>
-          <w:p/>
-        </w:tc>
-        <w:tc>
-          <w:tcPr>
-            <w:tcW w:type="dxa" w:w="794"/>
+            <w:tcW w:type="dxa" w:w="2778"/>
+          </w:tcPr>
+          <w:p/>
+        </w:tc>
+        <w:tc>
+          <w:tcPr>
+            <w:tcW w:type="dxa" w:w="635"/>
             <w:shd w:val="clear" w:color="auto" w:fill="FDE2E2"/>
           </w:tcPr>
           <w:p/>
         </w:tc>
         <w:tc>
           <w:tcPr>
-            <w:tcW w:type="dxa" w:w="794"/>
+            <w:tcW w:type="dxa" w:w="635"/>
             <w:shd w:val="clear" w:color="auto" w:fill="FDE2E2"/>
           </w:tcPr>
           <w:p/>
         </w:tc>
         <w:tc>
           <w:tcPr>
-            <w:tcW w:type="dxa" w:w="794"/>
+            <w:tcW w:type="dxa" w:w="635"/>
             <w:shd w:val="clear" w:color="auto" w:fill="FDE2E2"/>
           </w:tcPr>
           <w:p/>
         </w:tc>
         <w:tc>
           <w:tcPr>
-            <w:tcW w:type="dxa" w:w="794"/>
+            <w:tcW w:type="dxa" w:w="635"/>
             <w:shd w:val="clear" w:color="auto" w:fill="FEF6D0"/>
           </w:tcPr>
           <w:p/>
         </w:tc>
         <w:tc>
           <w:tcPr>
-            <w:tcW w:type="dxa" w:w="794"/>
+            <w:tcW w:type="dxa" w:w="635"/>
             <w:shd w:val="clear" w:color="auto" w:fill="FEF6D0"/>
           </w:tcPr>
           <w:p/>
         </w:tc>
         <w:tc>
           <w:tcPr>
-            <w:tcW w:type="dxa" w:w="794"/>
+            <w:tcW w:type="dxa" w:w="635"/>
             <w:shd w:val="clear" w:color="auto" w:fill="FEF6D0"/>
           </w:tcPr>
           <w:p/>
         </w:tc>
         <w:tc>
           <w:tcPr>
-            <w:tcW w:type="dxa" w:w="794"/>
+            <w:tcW w:type="dxa" w:w="635"/>
             <w:shd w:val="clear" w:color="auto" w:fill="DCE7FD"/>
           </w:tcPr>
           <w:p/>
         </w:tc>
         <w:tc>
           <w:tcPr>
-            <w:tcW w:type="dxa" w:w="794"/>
+            <w:tcW w:type="dxa" w:w="635"/>
             <w:shd w:val="clear" w:color="auto" w:fill="DCE7FD"/>
           </w:tcPr>
           <w:p/>
         </w:tc>
         <w:tc>
           <w:tcPr>
-            <w:tcW w:type="dxa" w:w="794"/>
+            <w:tcW w:type="dxa" w:w="635"/>
             <w:shd w:val="clear" w:color="auto" w:fill="DCE7FD"/>
           </w:tcPr>
           <w:p/>
         </w:tc>
         <w:tc>
           <w:tcPr>
-            <w:tcW w:type="dxa" w:w="794"/>
+            <w:tcW w:type="dxa" w:w="635"/>
             <w:shd w:val="clear" w:color="auto" w:fill="DCF3E4"/>
           </w:tcPr>
           <w:p/>
         </w:tc>
         <w:tc>
           <w:tcPr>
-            <w:tcW w:type="dxa" w:w="794"/>
+            <w:tcW w:type="dxa" w:w="635"/>
             <w:shd w:val="clear" w:color="auto" w:fill="DCF3E4"/>
           </w:tcPr>
           <w:p/>
         </w:tc>
         <w:tc>
           <w:tcPr>
-            <w:tcW w:type="dxa" w:w="794"/>
+            <w:tcW w:type="dxa" w:w="635"/>
             <w:shd w:val="clear" w:color="auto" w:fill="DCF3E4"/>
-          </w:tcPr>
-          <w:p/>
-        </w:tc>
-        <w:tc>
-          <w:tcPr>
-            <w:tcW w:type="dxa" w:w="1814"/>
           </w:tcPr>
           <w:p/>
         </w:tc>
       </w:tr>
       <w:tr>
         <w:trPr>
-          <w:trHeight w:val="283" w:hRule="atLeast"/>
+          <w:trHeight w:val="295" w:hRule="atLeast"/>
         </w:trPr>
         <w:tc>
           <w:tcPr>
-            <w:tcW w:type="dxa" w:w="454"/>
+            <w:tcW w:type="dxa" w:w="397"/>
             <w:vAlign w:val="center"/>
           </w:tcPr>
           <w:p>
@@ -1303,96 +1249,90 @@
         </w:tc>
         <w:tc>
           <w:tcPr>
-            <w:tcW w:type="dxa" w:w="2608"/>
-          </w:tcPr>
-          <w:p/>
-        </w:tc>
-        <w:tc>
-          <w:tcPr>
-            <w:tcW w:type="dxa" w:w="794"/>
-          </w:tcPr>
-          <w:p/>
-        </w:tc>
-        <w:tc>
-          <w:tcPr>
-            <w:tcW w:type="dxa" w:w="794"/>
-          </w:tcPr>
-          <w:p/>
-        </w:tc>
-        <w:tc>
-          <w:tcPr>
-            <w:tcW w:type="dxa" w:w="794"/>
-          </w:tcPr>
-          <w:p/>
-        </w:tc>
-        <w:tc>
-          <w:tcPr>
-            <w:tcW w:type="dxa" w:w="794"/>
-          </w:tcPr>
-          <w:p/>
-        </w:tc>
-        <w:tc>
-          <w:tcPr>
-            <w:tcW w:type="dxa" w:w="794"/>
-          </w:tcPr>
-          <w:p/>
-        </w:tc>
-        <w:tc>
-          <w:tcPr>
-            <w:tcW w:type="dxa" w:w="794"/>
-          </w:tcPr>
-          <w:p/>
-        </w:tc>
-        <w:tc>
-          <w:tcPr>
-            <w:tcW w:type="dxa" w:w="794"/>
-          </w:tcPr>
-          <w:p/>
-        </w:tc>
-        <w:tc>
-          <w:tcPr>
-            <w:tcW w:type="dxa" w:w="794"/>
-          </w:tcPr>
-          <w:p/>
-        </w:tc>
-        <w:tc>
-          <w:tcPr>
-            <w:tcW w:type="dxa" w:w="794"/>
-          </w:tcPr>
-          <w:p/>
-        </w:tc>
-        <w:tc>
-          <w:tcPr>
-            <w:tcW w:type="dxa" w:w="794"/>
-          </w:tcPr>
-          <w:p/>
-        </w:tc>
-        <w:tc>
-          <w:tcPr>
-            <w:tcW w:type="dxa" w:w="794"/>
-          </w:tcPr>
-          <w:p/>
-        </w:tc>
-        <w:tc>
-          <w:tcPr>
-            <w:tcW w:type="dxa" w:w="794"/>
-          </w:tcPr>
-          <w:p/>
-        </w:tc>
-        <w:tc>
-          <w:tcPr>
-            <w:tcW w:type="dxa" w:w="1814"/>
+            <w:tcW w:type="dxa" w:w="2778"/>
+          </w:tcPr>
+          <w:p/>
+        </w:tc>
+        <w:tc>
+          <w:tcPr>
+            <w:tcW w:type="dxa" w:w="635"/>
+          </w:tcPr>
+          <w:p/>
+        </w:tc>
+        <w:tc>
+          <w:tcPr>
+            <w:tcW w:type="dxa" w:w="635"/>
+          </w:tcPr>
+          <w:p/>
+        </w:tc>
+        <w:tc>
+          <w:tcPr>
+            <w:tcW w:type="dxa" w:w="635"/>
+          </w:tcPr>
+          <w:p/>
+        </w:tc>
+        <w:tc>
+          <w:tcPr>
+            <w:tcW w:type="dxa" w:w="635"/>
+          </w:tcPr>
+          <w:p/>
+        </w:tc>
+        <w:tc>
+          <w:tcPr>
+            <w:tcW w:type="dxa" w:w="635"/>
+          </w:tcPr>
+          <w:p/>
+        </w:tc>
+        <w:tc>
+          <w:tcPr>
+            <w:tcW w:type="dxa" w:w="635"/>
+          </w:tcPr>
+          <w:p/>
+        </w:tc>
+        <w:tc>
+          <w:tcPr>
+            <w:tcW w:type="dxa" w:w="635"/>
+          </w:tcPr>
+          <w:p/>
+        </w:tc>
+        <w:tc>
+          <w:tcPr>
+            <w:tcW w:type="dxa" w:w="635"/>
+          </w:tcPr>
+          <w:p/>
+        </w:tc>
+        <w:tc>
+          <w:tcPr>
+            <w:tcW w:type="dxa" w:w="635"/>
+          </w:tcPr>
+          <w:p/>
+        </w:tc>
+        <w:tc>
+          <w:tcPr>
+            <w:tcW w:type="dxa" w:w="635"/>
+          </w:tcPr>
+          <w:p/>
+        </w:tc>
+        <w:tc>
+          <w:tcPr>
+            <w:tcW w:type="dxa" w:w="635"/>
+          </w:tcPr>
+          <w:p/>
+        </w:tc>
+        <w:tc>
+          <w:tcPr>
+            <w:tcW w:type="dxa" w:w="635"/>
           </w:tcPr>
           <w:p/>
         </w:tc>
       </w:tr>
       <w:tr>
         <w:trPr>
-          <w:trHeight w:val="283" w:hRule="atLeast"/>
+          <w:trHeight w:val="295" w:hRule="atLeast"/>
         </w:trPr>
         <w:tc>
           <w:tcPr>
-            <w:tcW w:type="dxa" w:w="454"/>
+            <w:tcW w:type="dxa" w:w="397"/>
             <w:vAlign w:val="center"/>
           </w:tcPr>
           <w:p>
@@ -1411,108 +1351,102 @@
         </w:tc>
         <w:tc>
           <w:tcPr>
-            <w:tcW w:type="dxa" w:w="2608"/>
-          </w:tcPr>
-          <w:p/>
-        </w:tc>
-        <w:tc>
-          <w:tcPr>
-            <w:tcW w:type="dxa" w:w="794"/>
+            <w:tcW w:type="dxa" w:w="2778"/>
+          </w:tcPr>
+          <w:p/>
+        </w:tc>
+        <w:tc>
+          <w:tcPr>
+            <w:tcW w:type="dxa" w:w="635"/>
             <w:shd w:val="clear" w:color="auto" w:fill="FDE2E2"/>
           </w:tcPr>
           <w:p/>
         </w:tc>
         <w:tc>
           <w:tcPr>
-            <w:tcW w:type="dxa" w:w="794"/>
+            <w:tcW w:type="dxa" w:w="635"/>
             <w:shd w:val="clear" w:color="auto" w:fill="FDE2E2"/>
           </w:tcPr>
           <w:p/>
         </w:tc>
         <w:tc>
           <w:tcPr>
-            <w:tcW w:type="dxa" w:w="794"/>
+            <w:tcW w:type="dxa" w:w="635"/>
             <w:shd w:val="clear" w:color="auto" w:fill="FDE2E2"/>
           </w:tcPr>
           <w:p/>
         </w:tc>
         <w:tc>
           <w:tcPr>
-            <w:tcW w:type="dxa" w:w="794"/>
+            <w:tcW w:type="dxa" w:w="635"/>
             <w:shd w:val="clear" w:color="auto" w:fill="FEF6D0"/>
           </w:tcPr>
           <w:p/>
         </w:tc>
         <w:tc>
           <w:tcPr>
-            <w:tcW w:type="dxa" w:w="794"/>
+            <w:tcW w:type="dxa" w:w="635"/>
             <w:shd w:val="clear" w:color="auto" w:fill="FEF6D0"/>
           </w:tcPr>
           <w:p/>
         </w:tc>
         <w:tc>
           <w:tcPr>
-            <w:tcW w:type="dxa" w:w="794"/>
+            <w:tcW w:type="dxa" w:w="635"/>
             <w:shd w:val="clear" w:color="auto" w:fill="FEF6D0"/>
           </w:tcPr>
           <w:p/>
         </w:tc>
         <w:tc>
           <w:tcPr>
-            <w:tcW w:type="dxa" w:w="794"/>
+            <w:tcW w:type="dxa" w:w="635"/>
             <w:shd w:val="clear" w:color="auto" w:fill="DCE7FD"/>
           </w:tcPr>
           <w:p/>
         </w:tc>
         <w:tc>
           <w:tcPr>
-            <w:tcW w:type="dxa" w:w="794"/>
+            <w:tcW w:type="dxa" w:w="635"/>
             <w:shd w:val="clear" w:color="auto" w:fill="DCE7FD"/>
           </w:tcPr>
           <w:p/>
         </w:tc>
         <w:tc>
           <w:tcPr>
-            <w:tcW w:type="dxa" w:w="794"/>
+            <w:tcW w:type="dxa" w:w="635"/>
             <w:shd w:val="clear" w:color="auto" w:fill="DCE7FD"/>
           </w:tcPr>
           <w:p/>
         </w:tc>
         <w:tc>
           <w:tcPr>
-            <w:tcW w:type="dxa" w:w="794"/>
+            <w:tcW w:type="dxa" w:w="635"/>
             <w:shd w:val="clear" w:color="auto" w:fill="DCF3E4"/>
           </w:tcPr>
           <w:p/>
         </w:tc>
         <w:tc>
           <w:tcPr>
-            <w:tcW w:type="dxa" w:w="794"/>
+            <w:tcW w:type="dxa" w:w="635"/>
             <w:shd w:val="clear" w:color="auto" w:fill="DCF3E4"/>
           </w:tcPr>
           <w:p/>
         </w:tc>
         <w:tc>
           <w:tcPr>
-            <w:tcW w:type="dxa" w:w="794"/>
+            <w:tcW w:type="dxa" w:w="635"/>
             <w:shd w:val="clear" w:color="auto" w:fill="DCF3E4"/>
-          </w:tcPr>
-          <w:p/>
-        </w:tc>
-        <w:tc>
-          <w:tcPr>
-            <w:tcW w:type="dxa" w:w="1814"/>
           </w:tcPr>
           <w:p/>
         </w:tc>
       </w:tr>
       <w:tr>
         <w:trPr>
-          <w:trHeight w:val="283" w:hRule="atLeast"/>
+          <w:trHeight w:val="295" w:hRule="atLeast"/>
         </w:trPr>
         <w:tc>
           <w:tcPr>
-            <w:tcW w:type="dxa" w:w="454"/>
+            <w:tcW w:type="dxa" w:w="397"/>
             <w:vAlign w:val="center"/>
           </w:tcPr>
           <w:p>
@@ -1531,96 +1465,90 @@
         </w:tc>
         <w:tc>
           <w:tcPr>
-            <w:tcW w:type="dxa" w:w="2608"/>
-          </w:tcPr>
-          <w:p/>
-        </w:tc>
-        <w:tc>
-          <w:tcPr>
-            <w:tcW w:type="dxa" w:w="794"/>
-          </w:tcPr>
-          <w:p/>
-        </w:tc>
-        <w:tc>
-          <w:tcPr>
-            <w:tcW w:type="dxa" w:w="794"/>
-          </w:tcPr>
-          <w:p/>
-        </w:tc>
-        <w:tc>
-          <w:tcPr>
-            <w:tcW w:type="dxa" w:w="794"/>
-          </w:tcPr>
-          <w:p/>
-        </w:tc>
-        <w:tc>
-          <w:tcPr>
-            <w:tcW w:type="dxa" w:w="794"/>
-          </w:tcPr>
-          <w:p/>
-        </w:tc>
-        <w:tc>
-          <w:tcPr>
-            <w:tcW w:type="dxa" w:w="794"/>
-          </w:tcPr>
-          <w:p/>
-        </w:tc>
-        <w:tc>
-          <w:tcPr>
-            <w:tcW w:type="dxa" w:w="794"/>
-          </w:tcPr>
-          <w:p/>
-        </w:tc>
-        <w:tc>
-          <w:tcPr>
-            <w:tcW w:type="dxa" w:w="794"/>
-          </w:tcPr>
-          <w:p/>
-        </w:tc>
-        <w:tc>
-          <w:tcPr>
-            <w:tcW w:type="dxa" w:w="794"/>
-          </w:tcPr>
-          <w:p/>
-        </w:tc>
-        <w:tc>
-          <w:tcPr>
-            <w:tcW w:type="dxa" w:w="794"/>
-          </w:tcPr>
-          <w:p/>
-        </w:tc>
-        <w:tc>
-          <w:tcPr>
-            <w:tcW w:type="dxa" w:w="794"/>
-          </w:tcPr>
-          <w:p/>
-        </w:tc>
-        <w:tc>
-          <w:tcPr>
-            <w:tcW w:type="dxa" w:w="794"/>
-          </w:tcPr>
-          <w:p/>
-        </w:tc>
-        <w:tc>
-          <w:tcPr>
-            <w:tcW w:type="dxa" w:w="794"/>
-          </w:tcPr>
-          <w:p/>
-        </w:tc>
-        <w:tc>
-          <w:tcPr>
-            <w:tcW w:type="dxa" w:w="1814"/>
+            <w:tcW w:type="dxa" w:w="2778"/>
+          </w:tcPr>
+          <w:p/>
+        </w:tc>
+        <w:tc>
+          <w:tcPr>
+            <w:tcW w:type="dxa" w:w="635"/>
+          </w:tcPr>
+          <w:p/>
+        </w:tc>
+        <w:tc>
+          <w:tcPr>
+            <w:tcW w:type="dxa" w:w="635"/>
+          </w:tcPr>
+          <w:p/>
+        </w:tc>
+        <w:tc>
+          <w:tcPr>
+            <w:tcW w:type="dxa" w:w="635"/>
+          </w:tcPr>
+          <w:p/>
+        </w:tc>
+        <w:tc>
+          <w:tcPr>
+            <w:tcW w:type="dxa" w:w="635"/>
+          </w:tcPr>
+          <w:p/>
+        </w:tc>
+        <w:tc>
+          <w:tcPr>
+            <w:tcW w:type="dxa" w:w="635"/>
+          </w:tcPr>
+          <w:p/>
+        </w:tc>
+        <w:tc>
+          <w:tcPr>
+            <w:tcW w:type="dxa" w:w="635"/>
+          </w:tcPr>
+          <w:p/>
+        </w:tc>
+        <w:tc>
+          <w:tcPr>
+            <w:tcW w:type="dxa" w:w="635"/>
+          </w:tcPr>
+          <w:p/>
+        </w:tc>
+        <w:tc>
+          <w:tcPr>
+            <w:tcW w:type="dxa" w:w="635"/>
+          </w:tcPr>
+          <w:p/>
+        </w:tc>
+        <w:tc>
+          <w:tcPr>
+            <w:tcW w:type="dxa" w:w="635"/>
+          </w:tcPr>
+          <w:p/>
+        </w:tc>
+        <w:tc>
+          <w:tcPr>
+            <w:tcW w:type="dxa" w:w="635"/>
+          </w:tcPr>
+          <w:p/>
+        </w:tc>
+        <w:tc>
+          <w:tcPr>
+            <w:tcW w:type="dxa" w:w="635"/>
+          </w:tcPr>
+          <w:p/>
+        </w:tc>
+        <w:tc>
+          <w:tcPr>
+            <w:tcW w:type="dxa" w:w="635"/>
           </w:tcPr>
           <w:p/>
         </w:tc>
       </w:tr>
       <w:tr>
         <w:trPr>
-          <w:trHeight w:val="283" w:hRule="atLeast"/>
+          <w:trHeight w:val="295" w:hRule="atLeast"/>
         </w:trPr>
         <w:tc>
           <w:tcPr>
-            <w:tcW w:type="dxa" w:w="454"/>
+            <w:tcW w:type="dxa" w:w="397"/>
             <w:vAlign w:val="center"/>
           </w:tcPr>
           <w:p>
@@ -1639,108 +1567,102 @@
         </w:tc>
         <w:tc>
           <w:tcPr>
-            <w:tcW w:type="dxa" w:w="2608"/>
-          </w:tcPr>
-          <w:p/>
-        </w:tc>
-        <w:tc>
-          <w:tcPr>
-            <w:tcW w:type="dxa" w:w="794"/>
+            <w:tcW w:type="dxa" w:w="2778"/>
+          </w:tcPr>
+          <w:p/>
+        </w:tc>
+        <w:tc>
+          <w:tcPr>
+            <w:tcW w:type="dxa" w:w="635"/>
             <w:shd w:val="clear" w:color="auto" w:fill="FDE2E2"/>
           </w:tcPr>
           <w:p/>
         </w:tc>
         <w:tc>
           <w:tcPr>
-            <w:tcW w:type="dxa" w:w="794"/>
+            <w:tcW w:type="dxa" w:w="635"/>
             <w:shd w:val="clear" w:color="auto" w:fill="FDE2E2"/>
           </w:tcPr>
           <w:p/>
         </w:tc>
         <w:tc>
           <w:tcPr>
-            <w:tcW w:type="dxa" w:w="794"/>
+            <w:tcW w:type="dxa" w:w="635"/>
             <w:shd w:val="clear" w:color="auto" w:fill="FDE2E2"/>
           </w:tcPr>
           <w:p/>
         </w:tc>
         <w:tc>
           <w:tcPr>
-            <w:tcW w:type="dxa" w:w="794"/>
+            <w:tcW w:type="dxa" w:w="635"/>
             <w:shd w:val="clear" w:color="auto" w:fill="FEF6D0"/>
           </w:tcPr>
           <w:p/>
         </w:tc>
         <w:tc>
           <w:tcPr>
-            <w:tcW w:type="dxa" w:w="794"/>
+            <w:tcW w:type="dxa" w:w="635"/>
             <w:shd w:val="clear" w:color="auto" w:fill="FEF6D0"/>
           </w:tcPr>
           <w:p/>
         </w:tc>
         <w:tc>
           <w:tcPr>
-            <w:tcW w:type="dxa" w:w="794"/>
+            <w:tcW w:type="dxa" w:w="635"/>
             <w:shd w:val="clear" w:color="auto" w:fill="FEF6D0"/>
           </w:tcPr>
           <w:p/>
         </w:tc>
         <w:tc>
           <w:tcPr>
-            <w:tcW w:type="dxa" w:w="794"/>
+            <w:tcW w:type="dxa" w:w="635"/>
             <w:shd w:val="clear" w:color="auto" w:fill="DCE7FD"/>
           </w:tcPr>
           <w:p/>
         </w:tc>
         <w:tc>
           <w:tcPr>
-            <w:tcW w:type="dxa" w:w="794"/>
+            <w:tcW w:type="dxa" w:w="635"/>
             <w:shd w:val="clear" w:color="auto" w:fill="DCE7FD"/>
           </w:tcPr>
           <w:p/>
         </w:tc>
         <w:tc>
           <w:tcPr>
-            <w:tcW w:type="dxa" w:w="794"/>
+            <w:tcW w:type="dxa" w:w="635"/>
             <w:shd w:val="clear" w:color="auto" w:fill="DCE7FD"/>
           </w:tcPr>
           <w:p/>
         </w:tc>
         <w:tc>
           <w:tcPr>
-            <w:tcW w:type="dxa" w:w="794"/>
+            <w:tcW w:type="dxa" w:w="635"/>
             <w:shd w:val="clear" w:color="auto" w:fill="DCF3E4"/>
           </w:tcPr>
           <w:p/>
         </w:tc>
         <w:tc>
           <w:tcPr>
-            <w:tcW w:type="dxa" w:w="794"/>
+            <w:tcW w:type="dxa" w:w="635"/>
             <w:shd w:val="clear" w:color="auto" w:fill="DCF3E4"/>
           </w:tcPr>
           <w:p/>
         </w:tc>
         <w:tc>
           <w:tcPr>
-            <w:tcW w:type="dxa" w:w="794"/>
+            <w:tcW w:type="dxa" w:w="635"/>
             <w:shd w:val="clear" w:color="auto" w:fill="DCF3E4"/>
-          </w:tcPr>
-          <w:p/>
-        </w:tc>
-        <w:tc>
-          <w:tcPr>
-            <w:tcW w:type="dxa" w:w="1814"/>
           </w:tcPr>
           <w:p/>
         </w:tc>
       </w:tr>
       <w:tr>
         <w:trPr>
-          <w:trHeight w:val="283" w:hRule="atLeast"/>
+          <w:trHeight w:val="295" w:hRule="atLeast"/>
         </w:trPr>
         <w:tc>
           <w:tcPr>
-            <w:tcW w:type="dxa" w:w="454"/>
+            <w:tcW w:type="dxa" w:w="397"/>
             <w:vAlign w:val="center"/>
           </w:tcPr>
           <w:p>
@@ -1759,96 +1681,90 @@
         </w:tc>
         <w:tc>
           <w:tcPr>
-            <w:tcW w:type="dxa" w:w="2608"/>
-          </w:tcPr>
-          <w:p/>
-        </w:tc>
-        <w:tc>
-          <w:tcPr>
-            <w:tcW w:type="dxa" w:w="794"/>
-          </w:tcPr>
-          <w:p/>
-        </w:tc>
-        <w:tc>
-          <w:tcPr>
-            <w:tcW w:type="dxa" w:w="794"/>
-          </w:tcPr>
-          <w:p/>
-        </w:tc>
-        <w:tc>
-          <w:tcPr>
-            <w:tcW w:type="dxa" w:w="794"/>
-          </w:tcPr>
-          <w:p/>
-        </w:tc>
-        <w:tc>
-          <w:tcPr>
-            <w:tcW w:type="dxa" w:w="794"/>
-          </w:tcPr>
-          <w:p/>
-        </w:tc>
-        <w:tc>
-          <w:tcPr>
-            <w:tcW w:type="dxa" w:w="794"/>
-          </w:tcPr>
-          <w:p/>
-        </w:tc>
-        <w:tc>
-          <w:tcPr>
-            <w:tcW w:type="dxa" w:w="794"/>
-          </w:tcPr>
-          <w:p/>
-        </w:tc>
-        <w:tc>
-          <w:tcPr>
-            <w:tcW w:type="dxa" w:w="794"/>
-          </w:tcPr>
-          <w:p/>
-        </w:tc>
-        <w:tc>
-          <w:tcPr>
-            <w:tcW w:type="dxa" w:w="794"/>
-          </w:tcPr>
-          <w:p/>
-        </w:tc>
-        <w:tc>
-          <w:tcPr>
-            <w:tcW w:type="dxa" w:w="794"/>
-          </w:tcPr>
-          <w:p/>
-        </w:tc>
-        <w:tc>
-          <w:tcPr>
-            <w:tcW w:type="dxa" w:w="794"/>
-          </w:tcPr>
-          <w:p/>
-        </w:tc>
-        <w:tc>
-          <w:tcPr>
-            <w:tcW w:type="dxa" w:w="794"/>
-          </w:tcPr>
-          <w:p/>
-        </w:tc>
-        <w:tc>
-          <w:tcPr>
-            <w:tcW w:type="dxa" w:w="794"/>
-          </w:tcPr>
-          <w:p/>
-        </w:tc>
-        <w:tc>
-          <w:tcPr>
-            <w:tcW w:type="dxa" w:w="1814"/>
+            <w:tcW w:type="dxa" w:w="2778"/>
+          </w:tcPr>
+          <w:p/>
+        </w:tc>
+        <w:tc>
+          <w:tcPr>
+            <w:tcW w:type="dxa" w:w="635"/>
+          </w:tcPr>
+          <w:p/>
+        </w:tc>
+        <w:tc>
+          <w:tcPr>
+            <w:tcW w:type="dxa" w:w="635"/>
+          </w:tcPr>
+          <w:p/>
+        </w:tc>
+        <w:tc>
+          <w:tcPr>
+            <w:tcW w:type="dxa" w:w="635"/>
+          </w:tcPr>
+          <w:p/>
+        </w:tc>
+        <w:tc>
+          <w:tcPr>
+            <w:tcW w:type="dxa" w:w="635"/>
+          </w:tcPr>
+          <w:p/>
+        </w:tc>
+        <w:tc>
+          <w:tcPr>
+            <w:tcW w:type="dxa" w:w="635"/>
+          </w:tcPr>
+          <w:p/>
+        </w:tc>
+        <w:tc>
+          <w:tcPr>
+            <w:tcW w:type="dxa" w:w="635"/>
+          </w:tcPr>
+          <w:p/>
+        </w:tc>
+        <w:tc>
+          <w:tcPr>
+            <w:tcW w:type="dxa" w:w="635"/>
+          </w:tcPr>
+          <w:p/>
+        </w:tc>
+        <w:tc>
+          <w:tcPr>
+            <w:tcW w:type="dxa" w:w="635"/>
+          </w:tcPr>
+          <w:p/>
+        </w:tc>
+        <w:tc>
+          <w:tcPr>
+            <w:tcW w:type="dxa" w:w="635"/>
+          </w:tcPr>
+          <w:p/>
+        </w:tc>
+        <w:tc>
+          <w:tcPr>
+            <w:tcW w:type="dxa" w:w="635"/>
+          </w:tcPr>
+          <w:p/>
+        </w:tc>
+        <w:tc>
+          <w:tcPr>
+            <w:tcW w:type="dxa" w:w="635"/>
+          </w:tcPr>
+          <w:p/>
+        </w:tc>
+        <w:tc>
+          <w:tcPr>
+            <w:tcW w:type="dxa" w:w="635"/>
           </w:tcPr>
           <w:p/>
         </w:tc>
       </w:tr>
       <w:tr>
         <w:trPr>
-          <w:trHeight w:val="283" w:hRule="atLeast"/>
+          <w:trHeight w:val="295" w:hRule="atLeast"/>
         </w:trPr>
         <w:tc>
           <w:tcPr>
-            <w:tcW w:type="dxa" w:w="454"/>
+            <w:tcW w:type="dxa" w:w="397"/>
             <w:vAlign w:val="center"/>
           </w:tcPr>
           <w:p>
@@ -1867,108 +1783,102 @@
         </w:tc>
         <w:tc>
           <w:tcPr>
-            <w:tcW w:type="dxa" w:w="2608"/>
-          </w:tcPr>
-          <w:p/>
-        </w:tc>
-        <w:tc>
-          <w:tcPr>
-            <w:tcW w:type="dxa" w:w="794"/>
+            <w:tcW w:type="dxa" w:w="2778"/>
+          </w:tcPr>
+          <w:p/>
+        </w:tc>
+        <w:tc>
+          <w:tcPr>
+            <w:tcW w:type="dxa" w:w="635"/>
             <w:shd w:val="clear" w:color="auto" w:fill="FDE2E2"/>
           </w:tcPr>
           <w:p/>
         </w:tc>
         <w:tc>
           <w:tcPr>
-            <w:tcW w:type="dxa" w:w="794"/>
+            <w:tcW w:type="dxa" w:w="635"/>
             <w:shd w:val="clear" w:color="auto" w:fill="FDE2E2"/>
           </w:tcPr>
           <w:p/>
         </w:tc>
         <w:tc>
           <w:tcPr>
-            <w:tcW w:type="dxa" w:w="794"/>
+            <w:tcW w:type="dxa" w:w="635"/>
             <w:shd w:val="clear" w:color="auto" w:fill="FDE2E2"/>
           </w:tcPr>
           <w:p/>
         </w:tc>
         <w:tc>
           <w:tcPr>
-            <w:tcW w:type="dxa" w:w="794"/>
+            <w:tcW w:type="dxa" w:w="635"/>
             <w:shd w:val="clear" w:color="auto" w:fill="FEF6D0"/>
           </w:tcPr>
           <w:p/>
         </w:tc>
         <w:tc>
           <w:tcPr>
-            <w:tcW w:type="dxa" w:w="794"/>
+            <w:tcW w:type="dxa" w:w="635"/>
             <w:shd w:val="clear" w:color="auto" w:fill="FEF6D0"/>
           </w:tcPr>
           <w:p/>
         </w:tc>
         <w:tc>
           <w:tcPr>
-            <w:tcW w:type="dxa" w:w="794"/>
+            <w:tcW w:type="dxa" w:w="635"/>
             <w:shd w:val="clear" w:color="auto" w:fill="FEF6D0"/>
           </w:tcPr>
           <w:p/>
         </w:tc>
         <w:tc>
           <w:tcPr>
-            <w:tcW w:type="dxa" w:w="794"/>
+            <w:tcW w:type="dxa" w:w="635"/>
             <w:shd w:val="clear" w:color="auto" w:fill="DCE7FD"/>
           </w:tcPr>
           <w:p/>
         </w:tc>
         <w:tc>
           <w:tcPr>
-            <w:tcW w:type="dxa" w:w="794"/>
+            <w:tcW w:type="dxa" w:w="635"/>
             <w:shd w:val="clear" w:color="auto" w:fill="DCE7FD"/>
           </w:tcPr>
           <w:p/>
         </w:tc>
         <w:tc>
           <w:tcPr>
-            <w:tcW w:type="dxa" w:w="794"/>
+            <w:tcW w:type="dxa" w:w="635"/>
             <w:shd w:val="clear" w:color="auto" w:fill="DCE7FD"/>
           </w:tcPr>
           <w:p/>
         </w:tc>
         <w:tc>
           <w:tcPr>
-            <w:tcW w:type="dxa" w:w="794"/>
+            <w:tcW w:type="dxa" w:w="635"/>
             <w:shd w:val="clear" w:color="auto" w:fill="DCF3E4"/>
           </w:tcPr>
           <w:p/>
         </w:tc>
         <w:tc>
           <w:tcPr>
-            <w:tcW w:type="dxa" w:w="794"/>
+            <w:tcW w:type="dxa" w:w="635"/>
             <w:shd w:val="clear" w:color="auto" w:fill="DCF3E4"/>
           </w:tcPr>
           <w:p/>
         </w:tc>
         <w:tc>
           <w:tcPr>
-            <w:tcW w:type="dxa" w:w="794"/>
+            <w:tcW w:type="dxa" w:w="635"/>
             <w:shd w:val="clear" w:color="auto" w:fill="DCF3E4"/>
-          </w:tcPr>
-          <w:p/>
-        </w:tc>
-        <w:tc>
-          <w:tcPr>
-            <w:tcW w:type="dxa" w:w="1814"/>
           </w:tcPr>
           <w:p/>
         </w:tc>
       </w:tr>
       <w:tr>
         <w:trPr>
-          <w:trHeight w:val="283" w:hRule="atLeast"/>
+          <w:trHeight w:val="295" w:hRule="atLeast"/>
         </w:trPr>
         <w:tc>
           <w:tcPr>
-            <w:tcW w:type="dxa" w:w="454"/>
+            <w:tcW w:type="dxa" w:w="397"/>
             <w:vAlign w:val="center"/>
           </w:tcPr>
           <w:p>
@@ -1987,96 +1897,90 @@
         </w:tc>
         <w:tc>
           <w:tcPr>
-            <w:tcW w:type="dxa" w:w="2608"/>
-          </w:tcPr>
-          <w:p/>
-        </w:tc>
-        <w:tc>
-          <w:tcPr>
-            <w:tcW w:type="dxa" w:w="794"/>
-          </w:tcPr>
-          <w:p/>
-        </w:tc>
-        <w:tc>
-          <w:tcPr>
-            <w:tcW w:type="dxa" w:w="794"/>
-          </w:tcPr>
-          <w:p/>
-        </w:tc>
-        <w:tc>
-          <w:tcPr>
-            <w:tcW w:type="dxa" w:w="794"/>
-          </w:tcPr>
-          <w:p/>
-        </w:tc>
-        <w:tc>
-          <w:tcPr>
-            <w:tcW w:type="dxa" w:w="794"/>
-          </w:tcPr>
-          <w:p/>
-        </w:tc>
-        <w:tc>
-          <w:tcPr>
-            <w:tcW w:type="dxa" w:w="794"/>
-          </w:tcPr>
-          <w:p/>
-        </w:tc>
-        <w:tc>
-          <w:tcPr>
-            <w:tcW w:type="dxa" w:w="794"/>
-          </w:tcPr>
-          <w:p/>
-        </w:tc>
-        <w:tc>
-          <w:tcPr>
-            <w:tcW w:type="dxa" w:w="794"/>
-          </w:tcPr>
-          <w:p/>
-        </w:tc>
-        <w:tc>
-          <w:tcPr>
-            <w:tcW w:type="dxa" w:w="794"/>
-          </w:tcPr>
-          <w:p/>
-        </w:tc>
-        <w:tc>
-          <w:tcPr>
-            <w:tcW w:type="dxa" w:w="794"/>
-          </w:tcPr>
-          <w:p/>
-        </w:tc>
-        <w:tc>
-          <w:tcPr>
-            <w:tcW w:type="dxa" w:w="794"/>
-          </w:tcPr>
-          <w:p/>
-        </w:tc>
-        <w:tc>
-          <w:tcPr>
-            <w:tcW w:type="dxa" w:w="794"/>
-          </w:tcPr>
-          <w:p/>
-        </w:tc>
-        <w:tc>
-          <w:tcPr>
-            <w:tcW w:type="dxa" w:w="794"/>
-          </w:tcPr>
-          <w:p/>
-        </w:tc>
-        <w:tc>
-          <w:tcPr>
-            <w:tcW w:type="dxa" w:w="1814"/>
+            <w:tcW w:type="dxa" w:w="2778"/>
+          </w:tcPr>
+          <w:p/>
+        </w:tc>
+        <w:tc>
+          <w:tcPr>
+            <w:tcW w:type="dxa" w:w="635"/>
+          </w:tcPr>
+          <w:p/>
+        </w:tc>
+        <w:tc>
+          <w:tcPr>
+            <w:tcW w:type="dxa" w:w="635"/>
+          </w:tcPr>
+          <w:p/>
+        </w:tc>
+        <w:tc>
+          <w:tcPr>
+            <w:tcW w:type="dxa" w:w="635"/>
+          </w:tcPr>
+          <w:p/>
+        </w:tc>
+        <w:tc>
+          <w:tcPr>
+            <w:tcW w:type="dxa" w:w="635"/>
+          </w:tcPr>
+          <w:p/>
+        </w:tc>
+        <w:tc>
+          <w:tcPr>
+            <w:tcW w:type="dxa" w:w="635"/>
+          </w:tcPr>
+          <w:p/>
+        </w:tc>
+        <w:tc>
+          <w:tcPr>
+            <w:tcW w:type="dxa" w:w="635"/>
+          </w:tcPr>
+          <w:p/>
+        </w:tc>
+        <w:tc>
+          <w:tcPr>
+            <w:tcW w:type="dxa" w:w="635"/>
+          </w:tcPr>
+          <w:p/>
+        </w:tc>
+        <w:tc>
+          <w:tcPr>
+            <w:tcW w:type="dxa" w:w="635"/>
+          </w:tcPr>
+          <w:p/>
+        </w:tc>
+        <w:tc>
+          <w:tcPr>
+            <w:tcW w:type="dxa" w:w="635"/>
+          </w:tcPr>
+          <w:p/>
+        </w:tc>
+        <w:tc>
+          <w:tcPr>
+            <w:tcW w:type="dxa" w:w="635"/>
+          </w:tcPr>
+          <w:p/>
+        </w:tc>
+        <w:tc>
+          <w:tcPr>
+            <w:tcW w:type="dxa" w:w="635"/>
+          </w:tcPr>
+          <w:p/>
+        </w:tc>
+        <w:tc>
+          <w:tcPr>
+            <w:tcW w:type="dxa" w:w="635"/>
           </w:tcPr>
           <w:p/>
         </w:tc>
       </w:tr>
       <w:tr>
         <w:trPr>
-          <w:trHeight w:val="283" w:hRule="atLeast"/>
+          <w:trHeight w:val="295" w:hRule="atLeast"/>
         </w:trPr>
         <w:tc>
           <w:tcPr>
-            <w:tcW w:type="dxa" w:w="454"/>
+            <w:tcW w:type="dxa" w:w="397"/>
             <w:vAlign w:val="center"/>
           </w:tcPr>
           <w:p>
@@ -2095,108 +1999,102 @@
         </w:tc>
         <w:tc>
           <w:tcPr>
-            <w:tcW w:type="dxa" w:w="2608"/>
-          </w:tcPr>
-          <w:p/>
-        </w:tc>
-        <w:tc>
-          <w:tcPr>
-            <w:tcW w:type="dxa" w:w="794"/>
+            <w:tcW w:type="dxa" w:w="2778"/>
+          </w:tcPr>
+          <w:p/>
+        </w:tc>
+        <w:tc>
+          <w:tcPr>
+            <w:tcW w:type="dxa" w:w="635"/>
             <w:shd w:val="clear" w:color="auto" w:fill="FDE2E2"/>
           </w:tcPr>
           <w:p/>
         </w:tc>
         <w:tc>
           <w:tcPr>
-            <w:tcW w:type="dxa" w:w="794"/>
+            <w:tcW w:type="dxa" w:w="635"/>
             <w:shd w:val="clear" w:color="auto" w:fill="FDE2E2"/>
           </w:tcPr>
           <w:p/>
         </w:tc>
         <w:tc>
           <w:tcPr>
-            <w:tcW w:type="dxa" w:w="794"/>
+            <w:tcW w:type="dxa" w:w="635"/>
             <w:shd w:val="clear" w:color="auto" w:fill="FDE2E2"/>
           </w:tcPr>
           <w:p/>
         </w:tc>
         <w:tc>
           <w:tcPr>
-            <w:tcW w:type="dxa" w:w="794"/>
+            <w:tcW w:type="dxa" w:w="635"/>
             <w:shd w:val="clear" w:color="auto" w:fill="FEF6D0"/>
           </w:tcPr>
           <w:p/>
         </w:tc>
         <w:tc>
           <w:tcPr>
-            <w:tcW w:type="dxa" w:w="794"/>
+            <w:tcW w:type="dxa" w:w="635"/>
             <w:shd w:val="clear" w:color="auto" w:fill="FEF6D0"/>
           </w:tcPr>
           <w:p/>
         </w:tc>
         <w:tc>
           <w:tcPr>
-            <w:tcW w:type="dxa" w:w="794"/>
+            <w:tcW w:type="dxa" w:w="635"/>
             <w:shd w:val="clear" w:color="auto" w:fill="FEF6D0"/>
           </w:tcPr>
           <w:p/>
         </w:tc>
         <w:tc>
           <w:tcPr>
-            <w:tcW w:type="dxa" w:w="794"/>
+            <w:tcW w:type="dxa" w:w="635"/>
             <w:shd w:val="clear" w:color="auto" w:fill="DCE7FD"/>
           </w:tcPr>
           <w:p/>
         </w:tc>
         <w:tc>
           <w:tcPr>
-            <w:tcW w:type="dxa" w:w="794"/>
+            <w:tcW w:type="dxa" w:w="635"/>
             <w:shd w:val="clear" w:color="auto" w:fill="DCE7FD"/>
           </w:tcPr>
           <w:p/>
         </w:tc>
         <w:tc>
           <w:tcPr>
-            <w:tcW w:type="dxa" w:w="794"/>
+            <w:tcW w:type="dxa" w:w="635"/>
             <w:shd w:val="clear" w:color="auto" w:fill="DCE7FD"/>
           </w:tcPr>
           <w:p/>
         </w:tc>
         <w:tc>
           <w:tcPr>
-            <w:tcW w:type="dxa" w:w="794"/>
+            <w:tcW w:type="dxa" w:w="635"/>
             <w:shd w:val="clear" w:color="auto" w:fill="DCF3E4"/>
           </w:tcPr>
           <w:p/>
         </w:tc>
         <w:tc>
           <w:tcPr>
-            <w:tcW w:type="dxa" w:w="794"/>
+            <w:tcW w:type="dxa" w:w="635"/>
             <w:shd w:val="clear" w:color="auto" w:fill="DCF3E4"/>
           </w:tcPr>
           <w:p/>
         </w:tc>
         <w:tc>
           <w:tcPr>
-            <w:tcW w:type="dxa" w:w="794"/>
+            <w:tcW w:type="dxa" w:w="635"/>
             <w:shd w:val="clear" w:color="auto" w:fill="DCF3E4"/>
-          </w:tcPr>
-          <w:p/>
-        </w:tc>
-        <w:tc>
-          <w:tcPr>
-            <w:tcW w:type="dxa" w:w="1814"/>
           </w:tcPr>
           <w:p/>
         </w:tc>
       </w:tr>
       <w:tr>
         <w:trPr>
-          <w:trHeight w:val="283" w:hRule="atLeast"/>
+          <w:trHeight w:val="295" w:hRule="atLeast"/>
         </w:trPr>
         <w:tc>
           <w:tcPr>
-            <w:tcW w:type="dxa" w:w="454"/>
+            <w:tcW w:type="dxa" w:w="397"/>
             <w:vAlign w:val="center"/>
           </w:tcPr>
           <w:p>
@@ -2215,96 +2113,90 @@
         </w:tc>
         <w:tc>
           <w:tcPr>
-            <w:tcW w:type="dxa" w:w="2608"/>
-          </w:tcPr>
-          <w:p/>
-        </w:tc>
-        <w:tc>
-          <w:tcPr>
-            <w:tcW w:type="dxa" w:w="794"/>
-          </w:tcPr>
-          <w:p/>
-        </w:tc>
-        <w:tc>
-          <w:tcPr>
-            <w:tcW w:type="dxa" w:w="794"/>
-          </w:tcPr>
-          <w:p/>
-        </w:tc>
-        <w:tc>
-          <w:tcPr>
-            <w:tcW w:type="dxa" w:w="794"/>
-          </w:tcPr>
-          <w:p/>
-        </w:tc>
-        <w:tc>
-          <w:tcPr>
-            <w:tcW w:type="dxa" w:w="794"/>
-          </w:tcPr>
-          <w:p/>
-        </w:tc>
-        <w:tc>
-          <w:tcPr>
-            <w:tcW w:type="dxa" w:w="794"/>
-          </w:tcPr>
-          <w:p/>
-        </w:tc>
-        <w:tc>
-          <w:tcPr>
-            <w:tcW w:type="dxa" w:w="794"/>
-          </w:tcPr>
-          <w:p/>
-        </w:tc>
-        <w:tc>
-          <w:tcPr>
-            <w:tcW w:type="dxa" w:w="794"/>
-          </w:tcPr>
-          <w:p/>
-        </w:tc>
-        <w:tc>
-          <w:tcPr>
-            <w:tcW w:type="dxa" w:w="794"/>
-          </w:tcPr>
-          <w:p/>
-        </w:tc>
-        <w:tc>
-          <w:tcPr>
-            <w:tcW w:type="dxa" w:w="794"/>
-          </w:tcPr>
-          <w:p/>
-        </w:tc>
-        <w:tc>
-          <w:tcPr>
-            <w:tcW w:type="dxa" w:w="794"/>
-          </w:tcPr>
-          <w:p/>
-        </w:tc>
-        <w:tc>
-          <w:tcPr>
-            <w:tcW w:type="dxa" w:w="794"/>
-          </w:tcPr>
-          <w:p/>
-        </w:tc>
-        <w:tc>
-          <w:tcPr>
-            <w:tcW w:type="dxa" w:w="794"/>
-          </w:tcPr>
-          <w:p/>
-        </w:tc>
-        <w:tc>
-          <w:tcPr>
-            <w:tcW w:type="dxa" w:w="1814"/>
+            <w:tcW w:type="dxa" w:w="2778"/>
+          </w:tcPr>
+          <w:p/>
+        </w:tc>
+        <w:tc>
+          <w:tcPr>
+            <w:tcW w:type="dxa" w:w="635"/>
+          </w:tcPr>
+          <w:p/>
+        </w:tc>
+        <w:tc>
+          <w:tcPr>
+            <w:tcW w:type="dxa" w:w="635"/>
+          </w:tcPr>
+          <w:p/>
+        </w:tc>
+        <w:tc>
+          <w:tcPr>
+            <w:tcW w:type="dxa" w:w="635"/>
+          </w:tcPr>
+          <w:p/>
+        </w:tc>
+        <w:tc>
+          <w:tcPr>
+            <w:tcW w:type="dxa" w:w="635"/>
+          </w:tcPr>
+          <w:p/>
+        </w:tc>
+        <w:tc>
+          <w:tcPr>
+            <w:tcW w:type="dxa" w:w="635"/>
+          </w:tcPr>
+          <w:p/>
+        </w:tc>
+        <w:tc>
+          <w:tcPr>
+            <w:tcW w:type="dxa" w:w="635"/>
+          </w:tcPr>
+          <w:p/>
+        </w:tc>
+        <w:tc>
+          <w:tcPr>
+            <w:tcW w:type="dxa" w:w="635"/>
+          </w:tcPr>
+          <w:p/>
+        </w:tc>
+        <w:tc>
+          <w:tcPr>
+            <w:tcW w:type="dxa" w:w="635"/>
+          </w:tcPr>
+          <w:p/>
+        </w:tc>
+        <w:tc>
+          <w:tcPr>
+            <w:tcW w:type="dxa" w:w="635"/>
+          </w:tcPr>
+          <w:p/>
+        </w:tc>
+        <w:tc>
+          <w:tcPr>
+            <w:tcW w:type="dxa" w:w="635"/>
+          </w:tcPr>
+          <w:p/>
+        </w:tc>
+        <w:tc>
+          <w:tcPr>
+            <w:tcW w:type="dxa" w:w="635"/>
+          </w:tcPr>
+          <w:p/>
+        </w:tc>
+        <w:tc>
+          <w:tcPr>
+            <w:tcW w:type="dxa" w:w="635"/>
           </w:tcPr>
           <w:p/>
         </w:tc>
       </w:tr>
       <w:tr>
         <w:trPr>
-          <w:trHeight w:val="283" w:hRule="atLeast"/>
+          <w:trHeight w:val="295" w:hRule="atLeast"/>
         </w:trPr>
         <w:tc>
           <w:tcPr>
-            <w:tcW w:type="dxa" w:w="454"/>
+            <w:tcW w:type="dxa" w:w="397"/>
             <w:vAlign w:val="center"/>
           </w:tcPr>
           <w:p>
@@ -2323,108 +2215,102 @@
         </w:tc>
         <w:tc>
           <w:tcPr>
-            <w:tcW w:type="dxa" w:w="2608"/>
-          </w:tcPr>
-          <w:p/>
-        </w:tc>
-        <w:tc>
-          <w:tcPr>
-            <w:tcW w:type="dxa" w:w="794"/>
+            <w:tcW w:type="dxa" w:w="2778"/>
+          </w:tcPr>
+          <w:p/>
+        </w:tc>
+        <w:tc>
+          <w:tcPr>
+            <w:tcW w:type="dxa" w:w="635"/>
             <w:shd w:val="clear" w:color="auto" w:fill="FDE2E2"/>
           </w:tcPr>
           <w:p/>
         </w:tc>
         <w:tc>
           <w:tcPr>
-            <w:tcW w:type="dxa" w:w="794"/>
+            <w:tcW w:type="dxa" w:w="635"/>
             <w:shd w:val="clear" w:color="auto" w:fill="FDE2E2"/>
           </w:tcPr>
           <w:p/>
         </w:tc>
         <w:tc>
           <w:tcPr>
-            <w:tcW w:type="dxa" w:w="794"/>
+            <w:tcW w:type="dxa" w:w="635"/>
             <w:shd w:val="clear" w:color="auto" w:fill="FDE2E2"/>
           </w:tcPr>
           <w:p/>
         </w:tc>
         <w:tc>
           <w:tcPr>
-            <w:tcW w:type="dxa" w:w="794"/>
+            <w:tcW w:type="dxa" w:w="635"/>
             <w:shd w:val="clear" w:color="auto" w:fill="FEF6D0"/>
           </w:tcPr>
           <w:p/>
         </w:tc>
         <w:tc>
           <w:tcPr>
-            <w:tcW w:type="dxa" w:w="794"/>
+            <w:tcW w:type="dxa" w:w="635"/>
             <w:shd w:val="clear" w:color="auto" w:fill="FEF6D0"/>
           </w:tcPr>
           <w:p/>
         </w:tc>
         <w:tc>
           <w:tcPr>
-            <w:tcW w:type="dxa" w:w="794"/>
+            <w:tcW w:type="dxa" w:w="635"/>
             <w:shd w:val="clear" w:color="auto" w:fill="FEF6D0"/>
           </w:tcPr>
           <w:p/>
         </w:tc>
         <w:tc>
           <w:tcPr>
-            <w:tcW w:type="dxa" w:w="794"/>
+            <w:tcW w:type="dxa" w:w="635"/>
             <w:shd w:val="clear" w:color="auto" w:fill="DCE7FD"/>
           </w:tcPr>
           <w:p/>
         </w:tc>
         <w:tc>
           <w:tcPr>
-            <w:tcW w:type="dxa" w:w="794"/>
+            <w:tcW w:type="dxa" w:w="635"/>
             <w:shd w:val="clear" w:color="auto" w:fill="DCE7FD"/>
           </w:tcPr>
           <w:p/>
         </w:tc>
         <w:tc>
           <w:tcPr>
-            <w:tcW w:type="dxa" w:w="794"/>
+            <w:tcW w:type="dxa" w:w="635"/>
             <w:shd w:val="clear" w:color="auto" w:fill="DCE7FD"/>
           </w:tcPr>
           <w:p/>
         </w:tc>
         <w:tc>
           <w:tcPr>
-            <w:tcW w:type="dxa" w:w="794"/>
+            <w:tcW w:type="dxa" w:w="635"/>
             <w:shd w:val="clear" w:color="auto" w:fill="DCF3E4"/>
           </w:tcPr>
           <w:p/>
         </w:tc>
         <w:tc>
           <w:tcPr>
-            <w:tcW w:type="dxa" w:w="794"/>
+            <w:tcW w:type="dxa" w:w="635"/>
             <w:shd w:val="clear" w:color="auto" w:fill="DCF3E4"/>
           </w:tcPr>
           <w:p/>
         </w:tc>
         <w:tc>
           <w:tcPr>
-            <w:tcW w:type="dxa" w:w="794"/>
+            <w:tcW w:type="dxa" w:w="635"/>
             <w:shd w:val="clear" w:color="auto" w:fill="DCF3E4"/>
-          </w:tcPr>
-          <w:p/>
-        </w:tc>
-        <w:tc>
-          <w:tcPr>
-            <w:tcW w:type="dxa" w:w="1814"/>
           </w:tcPr>
           <w:p/>
         </w:tc>
       </w:tr>
       <w:tr>
         <w:trPr>
-          <w:trHeight w:val="283" w:hRule="atLeast"/>
+          <w:trHeight w:val="295" w:hRule="atLeast"/>
         </w:trPr>
         <w:tc>
           <w:tcPr>
-            <w:tcW w:type="dxa" w:w="454"/>
+            <w:tcW w:type="dxa" w:w="397"/>
             <w:vAlign w:val="center"/>
           </w:tcPr>
           <w:p>
@@ -2443,96 +2329,90 @@
         </w:tc>
         <w:tc>
           <w:tcPr>
-            <w:tcW w:type="dxa" w:w="2608"/>
-          </w:tcPr>
-          <w:p/>
-        </w:tc>
-        <w:tc>
-          <w:tcPr>
-            <w:tcW w:type="dxa" w:w="794"/>
-          </w:tcPr>
-          <w:p/>
-        </w:tc>
-        <w:tc>
-          <w:tcPr>
-            <w:tcW w:type="dxa" w:w="794"/>
-          </w:tcPr>
-          <w:p/>
-        </w:tc>
-        <w:tc>
-          <w:tcPr>
-            <w:tcW w:type="dxa" w:w="794"/>
-          </w:tcPr>
-          <w:p/>
-        </w:tc>
-        <w:tc>
-          <w:tcPr>
-            <w:tcW w:type="dxa" w:w="794"/>
-          </w:tcPr>
-          <w:p/>
-        </w:tc>
-        <w:tc>
-          <w:tcPr>
-            <w:tcW w:type="dxa" w:w="794"/>
-          </w:tcPr>
-          <w:p/>
-        </w:tc>
-        <w:tc>
-          <w:tcPr>
-            <w:tcW w:type="dxa" w:w="794"/>
-          </w:tcPr>
-          <w:p/>
-        </w:tc>
-        <w:tc>
-          <w:tcPr>
-            <w:tcW w:type="dxa" w:w="794"/>
-          </w:tcPr>
-          <w:p/>
-        </w:tc>
-        <w:tc>
-          <w:tcPr>
-            <w:tcW w:type="dxa" w:w="794"/>
-          </w:tcPr>
-          <w:p/>
-        </w:tc>
-        <w:tc>
-          <w:tcPr>
-            <w:tcW w:type="dxa" w:w="794"/>
-          </w:tcPr>
-          <w:p/>
-        </w:tc>
-        <w:tc>
-          <w:tcPr>
-            <w:tcW w:type="dxa" w:w="794"/>
-          </w:tcPr>
-          <w:p/>
-        </w:tc>
-        <w:tc>
-          <w:tcPr>
-            <w:tcW w:type="dxa" w:w="794"/>
-          </w:tcPr>
-          <w:p/>
-        </w:tc>
-        <w:tc>
-          <w:tcPr>
-            <w:tcW w:type="dxa" w:w="794"/>
-          </w:tcPr>
-          <w:p/>
-        </w:tc>
-        <w:tc>
-          <w:tcPr>
-            <w:tcW w:type="dxa" w:w="1814"/>
+            <w:tcW w:type="dxa" w:w="2778"/>
+          </w:tcPr>
+          <w:p/>
+        </w:tc>
+        <w:tc>
+          <w:tcPr>
+            <w:tcW w:type="dxa" w:w="635"/>
+          </w:tcPr>
+          <w:p/>
+        </w:tc>
+        <w:tc>
+          <w:tcPr>
+            <w:tcW w:type="dxa" w:w="635"/>
+          </w:tcPr>
+          <w:p/>
+        </w:tc>
+        <w:tc>
+          <w:tcPr>
+            <w:tcW w:type="dxa" w:w="635"/>
+          </w:tcPr>
+          <w:p/>
+        </w:tc>
+        <w:tc>
+          <w:tcPr>
+            <w:tcW w:type="dxa" w:w="635"/>
+          </w:tcPr>
+          <w:p/>
+        </w:tc>
+        <w:tc>
+          <w:tcPr>
+            <w:tcW w:type="dxa" w:w="635"/>
+          </w:tcPr>
+          <w:p/>
+        </w:tc>
+        <w:tc>
+          <w:tcPr>
+            <w:tcW w:type="dxa" w:w="635"/>
+          </w:tcPr>
+          <w:p/>
+        </w:tc>
+        <w:tc>
+          <w:tcPr>
+            <w:tcW w:type="dxa" w:w="635"/>
+          </w:tcPr>
+          <w:p/>
+        </w:tc>
+        <w:tc>
+          <w:tcPr>
+            <w:tcW w:type="dxa" w:w="635"/>
+          </w:tcPr>
+          <w:p/>
+        </w:tc>
+        <w:tc>
+          <w:tcPr>
+            <w:tcW w:type="dxa" w:w="635"/>
+          </w:tcPr>
+          <w:p/>
+        </w:tc>
+        <w:tc>
+          <w:tcPr>
+            <w:tcW w:type="dxa" w:w="635"/>
+          </w:tcPr>
+          <w:p/>
+        </w:tc>
+        <w:tc>
+          <w:tcPr>
+            <w:tcW w:type="dxa" w:w="635"/>
+          </w:tcPr>
+          <w:p/>
+        </w:tc>
+        <w:tc>
+          <w:tcPr>
+            <w:tcW w:type="dxa" w:w="635"/>
           </w:tcPr>
           <w:p/>
         </w:tc>
       </w:tr>
       <w:tr>
         <w:trPr>
-          <w:trHeight w:val="283" w:hRule="atLeast"/>
+          <w:trHeight w:val="295" w:hRule="atLeast"/>
         </w:trPr>
         <w:tc>
           <w:tcPr>
-            <w:tcW w:type="dxa" w:w="454"/>
+            <w:tcW w:type="dxa" w:w="397"/>
             <w:vAlign w:val="center"/>
           </w:tcPr>
           <w:p>
@@ -2551,108 +2431,102 @@
         </w:tc>
         <w:tc>
           <w:tcPr>
-            <w:tcW w:type="dxa" w:w="2608"/>
-          </w:tcPr>
-          <w:p/>
-        </w:tc>
-        <w:tc>
-          <w:tcPr>
-            <w:tcW w:type="dxa" w:w="794"/>
+            <w:tcW w:type="dxa" w:w="2778"/>
+          </w:tcPr>
+          <w:p/>
+        </w:tc>
+        <w:tc>
+          <w:tcPr>
+            <w:tcW w:type="dxa" w:w="635"/>
             <w:shd w:val="clear" w:color="auto" w:fill="FDE2E2"/>
           </w:tcPr>
           <w:p/>
         </w:tc>
         <w:tc>
           <w:tcPr>
-            <w:tcW w:type="dxa" w:w="794"/>
+            <w:tcW w:type="dxa" w:w="635"/>
             <w:shd w:val="clear" w:color="auto" w:fill="FDE2E2"/>
           </w:tcPr>
           <w:p/>
         </w:tc>
         <w:tc>
           <w:tcPr>
-            <w:tcW w:type="dxa" w:w="794"/>
+            <w:tcW w:type="dxa" w:w="635"/>
             <w:shd w:val="clear" w:color="auto" w:fill="FDE2E2"/>
           </w:tcPr>
           <w:p/>
         </w:tc>
         <w:tc>
           <w:tcPr>
-            <w:tcW w:type="dxa" w:w="794"/>
+            <w:tcW w:type="dxa" w:w="635"/>
             <w:shd w:val="clear" w:color="auto" w:fill="FEF6D0"/>
           </w:tcPr>
           <w:p/>
         </w:tc>
         <w:tc>
           <w:tcPr>
-            <w:tcW w:type="dxa" w:w="794"/>
+            <w:tcW w:type="dxa" w:w="635"/>
             <w:shd w:val="clear" w:color="auto" w:fill="FEF6D0"/>
           </w:tcPr>
           <w:p/>
         </w:tc>
         <w:tc>
           <w:tcPr>
-            <w:tcW w:type="dxa" w:w="794"/>
+            <w:tcW w:type="dxa" w:w="635"/>
             <w:shd w:val="clear" w:color="auto" w:fill="FEF6D0"/>
           </w:tcPr>
           <w:p/>
         </w:tc>
         <w:tc>
           <w:tcPr>
-            <w:tcW w:type="dxa" w:w="794"/>
+            <w:tcW w:type="dxa" w:w="635"/>
             <w:shd w:val="clear" w:color="auto" w:fill="DCE7FD"/>
           </w:tcPr>
           <w:p/>
         </w:tc>
         <w:tc>
           <w:tcPr>
-            <w:tcW w:type="dxa" w:w="794"/>
+            <w:tcW w:type="dxa" w:w="635"/>
             <w:shd w:val="clear" w:color="auto" w:fill="DCE7FD"/>
           </w:tcPr>
           <w:p/>
         </w:tc>
         <w:tc>
           <w:tcPr>
-            <w:tcW w:type="dxa" w:w="794"/>
+            <w:tcW w:type="dxa" w:w="635"/>
             <w:shd w:val="clear" w:color="auto" w:fill="DCE7FD"/>
           </w:tcPr>
           <w:p/>
         </w:tc>
         <w:tc>
           <w:tcPr>
-            <w:tcW w:type="dxa" w:w="794"/>
+            <w:tcW w:type="dxa" w:w="635"/>
             <w:shd w:val="clear" w:color="auto" w:fill="DCF3E4"/>
           </w:tcPr>
           <w:p/>
         </w:tc>
         <w:tc>
           <w:tcPr>
-            <w:tcW w:type="dxa" w:w="794"/>
+            <w:tcW w:type="dxa" w:w="635"/>
             <w:shd w:val="clear" w:color="auto" w:fill="DCF3E4"/>
           </w:tcPr>
           <w:p/>
         </w:tc>
         <w:tc>
           <w:tcPr>
-            <w:tcW w:type="dxa" w:w="794"/>
+            <w:tcW w:type="dxa" w:w="635"/>
             <w:shd w:val="clear" w:color="auto" w:fill="DCF3E4"/>
-          </w:tcPr>
-          <w:p/>
-        </w:tc>
-        <w:tc>
-          <w:tcPr>
-            <w:tcW w:type="dxa" w:w="1814"/>
           </w:tcPr>
           <w:p/>
         </w:tc>
       </w:tr>
       <w:tr>
         <w:trPr>
-          <w:trHeight w:val="283" w:hRule="atLeast"/>
+          <w:trHeight w:val="295" w:hRule="atLeast"/>
         </w:trPr>
         <w:tc>
           <w:tcPr>
-            <w:tcW w:type="dxa" w:w="454"/>
+            <w:tcW w:type="dxa" w:w="397"/>
             <w:vAlign w:val="center"/>
           </w:tcPr>
           <w:p>
@@ -2671,96 +2545,90 @@
         </w:tc>
         <w:tc>
           <w:tcPr>
-            <w:tcW w:type="dxa" w:w="2608"/>
-          </w:tcPr>
-          <w:p/>
-        </w:tc>
-        <w:tc>
-          <w:tcPr>
-            <w:tcW w:type="dxa" w:w="794"/>
-          </w:tcPr>
-          <w:p/>
-        </w:tc>
-        <w:tc>
-          <w:tcPr>
-            <w:tcW w:type="dxa" w:w="794"/>
-          </w:tcPr>
-          <w:p/>
-        </w:tc>
-        <w:tc>
-          <w:tcPr>
-            <w:tcW w:type="dxa" w:w="794"/>
-          </w:tcPr>
-          <w:p/>
-        </w:tc>
-        <w:tc>
-          <w:tcPr>
-            <w:tcW w:type="dxa" w:w="794"/>
-          </w:tcPr>
-          <w:p/>
-        </w:tc>
-        <w:tc>
-          <w:tcPr>
-            <w:tcW w:type="dxa" w:w="794"/>
-          </w:tcPr>
-          <w:p/>
-        </w:tc>
-        <w:tc>
-          <w:tcPr>
-            <w:tcW w:type="dxa" w:w="794"/>
-          </w:tcPr>
-          <w:p/>
-        </w:tc>
-        <w:tc>
-          <w:tcPr>
-            <w:tcW w:type="dxa" w:w="794"/>
-          </w:tcPr>
-          <w:p/>
-        </w:tc>
-        <w:tc>
-          <w:tcPr>
-            <w:tcW w:type="dxa" w:w="794"/>
-          </w:tcPr>
-          <w:p/>
-        </w:tc>
-        <w:tc>
-          <w:tcPr>
-            <w:tcW w:type="dxa" w:w="794"/>
-          </w:tcPr>
-          <w:p/>
-        </w:tc>
-        <w:tc>
-          <w:tcPr>
-            <w:tcW w:type="dxa" w:w="794"/>
-          </w:tcPr>
-          <w:p/>
-        </w:tc>
-        <w:tc>
-          <w:tcPr>
-            <w:tcW w:type="dxa" w:w="794"/>
-          </w:tcPr>
-          <w:p/>
-        </w:tc>
-        <w:tc>
-          <w:tcPr>
-            <w:tcW w:type="dxa" w:w="794"/>
-          </w:tcPr>
-          <w:p/>
-        </w:tc>
-        <w:tc>
-          <w:tcPr>
-            <w:tcW w:type="dxa" w:w="1814"/>
+            <w:tcW w:type="dxa" w:w="2778"/>
+          </w:tcPr>
+          <w:p/>
+        </w:tc>
+        <w:tc>
+          <w:tcPr>
+            <w:tcW w:type="dxa" w:w="635"/>
+          </w:tcPr>
+          <w:p/>
+        </w:tc>
+        <w:tc>
+          <w:tcPr>
+            <w:tcW w:type="dxa" w:w="635"/>
+          </w:tcPr>
+          <w:p/>
+        </w:tc>
+        <w:tc>
+          <w:tcPr>
+            <w:tcW w:type="dxa" w:w="635"/>
+          </w:tcPr>
+          <w:p/>
+        </w:tc>
+        <w:tc>
+          <w:tcPr>
+            <w:tcW w:type="dxa" w:w="635"/>
+          </w:tcPr>
+          <w:p/>
+        </w:tc>
+        <w:tc>
+          <w:tcPr>
+            <w:tcW w:type="dxa" w:w="635"/>
+          </w:tcPr>
+          <w:p/>
+        </w:tc>
+        <w:tc>
+          <w:tcPr>
+            <w:tcW w:type="dxa" w:w="635"/>
+          </w:tcPr>
+          <w:p/>
+        </w:tc>
+        <w:tc>
+          <w:tcPr>
+            <w:tcW w:type="dxa" w:w="635"/>
+          </w:tcPr>
+          <w:p/>
+        </w:tc>
+        <w:tc>
+          <w:tcPr>
+            <w:tcW w:type="dxa" w:w="635"/>
+          </w:tcPr>
+          <w:p/>
+        </w:tc>
+        <w:tc>
+          <w:tcPr>
+            <w:tcW w:type="dxa" w:w="635"/>
+          </w:tcPr>
+          <w:p/>
+        </w:tc>
+        <w:tc>
+          <w:tcPr>
+            <w:tcW w:type="dxa" w:w="635"/>
+          </w:tcPr>
+          <w:p/>
+        </w:tc>
+        <w:tc>
+          <w:tcPr>
+            <w:tcW w:type="dxa" w:w="635"/>
+          </w:tcPr>
+          <w:p/>
+        </w:tc>
+        <w:tc>
+          <w:tcPr>
+            <w:tcW w:type="dxa" w:w="635"/>
           </w:tcPr>
           <w:p/>
         </w:tc>
       </w:tr>
       <w:tr>
         <w:trPr>
-          <w:trHeight w:val="283" w:hRule="atLeast"/>
+          <w:trHeight w:val="295" w:hRule="atLeast"/>
         </w:trPr>
         <w:tc>
           <w:tcPr>
-            <w:tcW w:type="dxa" w:w="454"/>
+            <w:tcW w:type="dxa" w:w="397"/>
             <w:vAlign w:val="center"/>
           </w:tcPr>
           <w:p>
@@ -2779,108 +2647,102 @@
         </w:tc>
         <w:tc>
           <w:tcPr>
-            <w:tcW w:type="dxa" w:w="2608"/>
-          </w:tcPr>
-          <w:p/>
-        </w:tc>
-        <w:tc>
-          <w:tcPr>
-            <w:tcW w:type="dxa" w:w="794"/>
+            <w:tcW w:type="dxa" w:w="2778"/>
+          </w:tcPr>
+          <w:p/>
+        </w:tc>
+        <w:tc>
+          <w:tcPr>
+            <w:tcW w:type="dxa" w:w="635"/>
             <w:shd w:val="clear" w:color="auto" w:fill="FDE2E2"/>
           </w:tcPr>
           <w:p/>
         </w:tc>
         <w:tc>
           <w:tcPr>
-            <w:tcW w:type="dxa" w:w="794"/>
+            <w:tcW w:type="dxa" w:w="635"/>
             <w:shd w:val="clear" w:color="auto" w:fill="FDE2E2"/>
           </w:tcPr>
           <w:p/>
         </w:tc>
         <w:tc>
           <w:tcPr>
-            <w:tcW w:type="dxa" w:w="794"/>
+            <w:tcW w:type="dxa" w:w="635"/>
             <w:shd w:val="clear" w:color="auto" w:fill="FDE2E2"/>
           </w:tcPr>
           <w:p/>
         </w:tc>
         <w:tc>
           <w:tcPr>
-            <w:tcW w:type="dxa" w:w="794"/>
+            <w:tcW w:type="dxa" w:w="635"/>
             <w:shd w:val="clear" w:color="auto" w:fill="FEF6D0"/>
           </w:tcPr>
           <w:p/>
         </w:tc>
         <w:tc>
           <w:tcPr>
-            <w:tcW w:type="dxa" w:w="794"/>
+            <w:tcW w:type="dxa" w:w="635"/>
             <w:shd w:val="clear" w:color="auto" w:fill="FEF6D0"/>
           </w:tcPr>
           <w:p/>
         </w:tc>
         <w:tc>
           <w:tcPr>
-            <w:tcW w:type="dxa" w:w="794"/>
+            <w:tcW w:type="dxa" w:w="635"/>
             <w:shd w:val="clear" w:color="auto" w:fill="FEF6D0"/>
           </w:tcPr>
           <w:p/>
         </w:tc>
         <w:tc>
           <w:tcPr>
-            <w:tcW w:type="dxa" w:w="794"/>
+            <w:tcW w:type="dxa" w:w="635"/>
             <w:shd w:val="clear" w:color="auto" w:fill="DCE7FD"/>
           </w:tcPr>
           <w:p/>
         </w:tc>
         <w:tc>
           <w:tcPr>
-            <w:tcW w:type="dxa" w:w="794"/>
+            <w:tcW w:type="dxa" w:w="635"/>
             <w:shd w:val="clear" w:color="auto" w:fill="DCE7FD"/>
           </w:tcPr>
           <w:p/>
         </w:tc>
         <w:tc>
           <w:tcPr>
-            <w:tcW w:type="dxa" w:w="794"/>
+            <w:tcW w:type="dxa" w:w="635"/>
             <w:shd w:val="clear" w:color="auto" w:fill="DCE7FD"/>
           </w:tcPr>
           <w:p/>
         </w:tc>
         <w:tc>
           <w:tcPr>
-            <w:tcW w:type="dxa" w:w="794"/>
+            <w:tcW w:type="dxa" w:w="635"/>
             <w:shd w:val="clear" w:color="auto" w:fill="DCF3E4"/>
           </w:tcPr>
           <w:p/>
         </w:tc>
         <w:tc>
           <w:tcPr>
-            <w:tcW w:type="dxa" w:w="794"/>
+            <w:tcW w:type="dxa" w:w="635"/>
             <w:shd w:val="clear" w:color="auto" w:fill="DCF3E4"/>
           </w:tcPr>
           <w:p/>
         </w:tc>
         <w:tc>
           <w:tcPr>
-            <w:tcW w:type="dxa" w:w="794"/>
+            <w:tcW w:type="dxa" w:w="635"/>
             <w:shd w:val="clear" w:color="auto" w:fill="DCF3E4"/>
-          </w:tcPr>
-          <w:p/>
-        </w:tc>
-        <w:tc>
-          <w:tcPr>
-            <w:tcW w:type="dxa" w:w="1814"/>
           </w:tcPr>
           <w:p/>
         </w:tc>
       </w:tr>
       <w:tr>
         <w:trPr>
-          <w:trHeight w:val="283" w:hRule="atLeast"/>
+          <w:trHeight w:val="295" w:hRule="atLeast"/>
         </w:trPr>
         <w:tc>
           <w:tcPr>
-            <w:tcW w:type="dxa" w:w="454"/>
+            <w:tcW w:type="dxa" w:w="397"/>
             <w:vAlign w:val="center"/>
           </w:tcPr>
           <w:p>
@@ -2899,96 +2761,90 @@
         </w:tc>
         <w:tc>
           <w:tcPr>
-            <w:tcW w:type="dxa" w:w="2608"/>
-          </w:tcPr>
-          <w:p/>
-        </w:tc>
-        <w:tc>
-          <w:tcPr>
-            <w:tcW w:type="dxa" w:w="794"/>
-          </w:tcPr>
-          <w:p/>
-        </w:tc>
-        <w:tc>
-          <w:tcPr>
-            <w:tcW w:type="dxa" w:w="794"/>
-          </w:tcPr>
-          <w:p/>
-        </w:tc>
-        <w:tc>
-          <w:tcPr>
-            <w:tcW w:type="dxa" w:w="794"/>
-          </w:tcPr>
-          <w:p/>
-        </w:tc>
-        <w:tc>
-          <w:tcPr>
-            <w:tcW w:type="dxa" w:w="794"/>
-          </w:tcPr>
-          <w:p/>
-        </w:tc>
-        <w:tc>
-          <w:tcPr>
-            <w:tcW w:type="dxa" w:w="794"/>
-          </w:tcPr>
-          <w:p/>
-        </w:tc>
-        <w:tc>
-          <w:tcPr>
-            <w:tcW w:type="dxa" w:w="794"/>
-          </w:tcPr>
-          <w:p/>
-        </w:tc>
-        <w:tc>
-          <w:tcPr>
-            <w:tcW w:type="dxa" w:w="794"/>
-          </w:tcPr>
-          <w:p/>
-        </w:tc>
-        <w:tc>
-          <w:tcPr>
-            <w:tcW w:type="dxa" w:w="794"/>
-          </w:tcPr>
-          <w:p/>
-        </w:tc>
-        <w:tc>
-          <w:tcPr>
-            <w:tcW w:type="dxa" w:w="794"/>
-          </w:tcPr>
-          <w:p/>
-        </w:tc>
-        <w:tc>
-          <w:tcPr>
-            <w:tcW w:type="dxa" w:w="794"/>
-          </w:tcPr>
-          <w:p/>
-        </w:tc>
-        <w:tc>
-          <w:tcPr>
-            <w:tcW w:type="dxa" w:w="794"/>
-          </w:tcPr>
-          <w:p/>
-        </w:tc>
-        <w:tc>
-          <w:tcPr>
-            <w:tcW w:type="dxa" w:w="794"/>
-          </w:tcPr>
-          <w:p/>
-        </w:tc>
-        <w:tc>
-          <w:tcPr>
-            <w:tcW w:type="dxa" w:w="1814"/>
+            <w:tcW w:type="dxa" w:w="2778"/>
+          </w:tcPr>
+          <w:p/>
+        </w:tc>
+        <w:tc>
+          <w:tcPr>
+            <w:tcW w:type="dxa" w:w="635"/>
+          </w:tcPr>
+          <w:p/>
+        </w:tc>
+        <w:tc>
+          <w:tcPr>
+            <w:tcW w:type="dxa" w:w="635"/>
+          </w:tcPr>
+          <w:p/>
+        </w:tc>
+        <w:tc>
+          <w:tcPr>
+            <w:tcW w:type="dxa" w:w="635"/>
+          </w:tcPr>
+          <w:p/>
+        </w:tc>
+        <w:tc>
+          <w:tcPr>
+            <w:tcW w:type="dxa" w:w="635"/>
+          </w:tcPr>
+          <w:p/>
+        </w:tc>
+        <w:tc>
+          <w:tcPr>
+            <w:tcW w:type="dxa" w:w="635"/>
+          </w:tcPr>
+          <w:p/>
+        </w:tc>
+        <w:tc>
+          <w:tcPr>
+            <w:tcW w:type="dxa" w:w="635"/>
+          </w:tcPr>
+          <w:p/>
+        </w:tc>
+        <w:tc>
+          <w:tcPr>
+            <w:tcW w:type="dxa" w:w="635"/>
+          </w:tcPr>
+          <w:p/>
+        </w:tc>
+        <w:tc>
+          <w:tcPr>
+            <w:tcW w:type="dxa" w:w="635"/>
+          </w:tcPr>
+          <w:p/>
+        </w:tc>
+        <w:tc>
+          <w:tcPr>
+            <w:tcW w:type="dxa" w:w="635"/>
+          </w:tcPr>
+          <w:p/>
+        </w:tc>
+        <w:tc>
+          <w:tcPr>
+            <w:tcW w:type="dxa" w:w="635"/>
+          </w:tcPr>
+          <w:p/>
+        </w:tc>
+        <w:tc>
+          <w:tcPr>
+            <w:tcW w:type="dxa" w:w="635"/>
+          </w:tcPr>
+          <w:p/>
+        </w:tc>
+        <w:tc>
+          <w:tcPr>
+            <w:tcW w:type="dxa" w:w="635"/>
           </w:tcPr>
           <w:p/>
         </w:tc>
       </w:tr>
       <w:tr>
         <w:trPr>
-          <w:trHeight w:val="283" w:hRule="atLeast"/>
+          <w:trHeight w:val="295" w:hRule="atLeast"/>
         </w:trPr>
         <w:tc>
           <w:tcPr>
-            <w:tcW w:type="dxa" w:w="454"/>
+            <w:tcW w:type="dxa" w:w="397"/>
             <w:vAlign w:val="center"/>
           </w:tcPr>
           <w:p>
@@ -3007,108 +2863,102 @@
         </w:tc>
         <w:tc>
           <w:tcPr>
-            <w:tcW w:type="dxa" w:w="2608"/>
-          </w:tcPr>
-          <w:p/>
-        </w:tc>
-        <w:tc>
-          <w:tcPr>
-            <w:tcW w:type="dxa" w:w="794"/>
+            <w:tcW w:type="dxa" w:w="2778"/>
+          </w:tcPr>
+          <w:p/>
+        </w:tc>
+        <w:tc>
+          <w:tcPr>
+            <w:tcW w:type="dxa" w:w="635"/>
             <w:shd w:val="clear" w:color="auto" w:fill="FDE2E2"/>
           </w:tcPr>
           <w:p/>
         </w:tc>
         <w:tc>
           <w:tcPr>
-            <w:tcW w:type="dxa" w:w="794"/>
+            <w:tcW w:type="dxa" w:w="635"/>
             <w:shd w:val="clear" w:color="auto" w:fill="FDE2E2"/>
           </w:tcPr>
           <w:p/>
         </w:tc>
         <w:tc>
           <w:tcPr>
-            <w:tcW w:type="dxa" w:w="794"/>
+            <w:tcW w:type="dxa" w:w="635"/>
             <w:shd w:val="clear" w:color="auto" w:fill="FDE2E2"/>
           </w:tcPr>
           <w:p/>
         </w:tc>
         <w:tc>
           <w:tcPr>
-            <w:tcW w:type="dxa" w:w="794"/>
+            <w:tcW w:type="dxa" w:w="635"/>
             <w:shd w:val="clear" w:color="auto" w:fill="FEF6D0"/>
           </w:tcPr>
           <w:p/>
         </w:tc>
         <w:tc>
           <w:tcPr>
-            <w:tcW w:type="dxa" w:w="794"/>
+            <w:tcW w:type="dxa" w:w="635"/>
             <w:shd w:val="clear" w:color="auto" w:fill="FEF6D0"/>
           </w:tcPr>
           <w:p/>
         </w:tc>
         <w:tc>
           <w:tcPr>
-            <w:tcW w:type="dxa" w:w="794"/>
+            <w:tcW w:type="dxa" w:w="635"/>
             <w:shd w:val="clear" w:color="auto" w:fill="FEF6D0"/>
           </w:tcPr>
           <w:p/>
         </w:tc>
         <w:tc>
           <w:tcPr>
-            <w:tcW w:type="dxa" w:w="794"/>
+            <w:tcW w:type="dxa" w:w="635"/>
             <w:shd w:val="clear" w:color="auto" w:fill="DCE7FD"/>
           </w:tcPr>
           <w:p/>
         </w:tc>
         <w:tc>
           <w:tcPr>
-            <w:tcW w:type="dxa" w:w="794"/>
+            <w:tcW w:type="dxa" w:w="635"/>
             <w:shd w:val="clear" w:color="auto" w:fill="DCE7FD"/>
           </w:tcPr>
           <w:p/>
         </w:tc>
         <w:tc>
           <w:tcPr>
-            <w:tcW w:type="dxa" w:w="794"/>
+            <w:tcW w:type="dxa" w:w="635"/>
             <w:shd w:val="clear" w:color="auto" w:fill="DCE7FD"/>
           </w:tcPr>
           <w:p/>
         </w:tc>
         <w:tc>
           <w:tcPr>
-            <w:tcW w:type="dxa" w:w="794"/>
+            <w:tcW w:type="dxa" w:w="635"/>
             <w:shd w:val="clear" w:color="auto" w:fill="DCF3E4"/>
           </w:tcPr>
           <w:p/>
         </w:tc>
         <w:tc>
           <w:tcPr>
-            <w:tcW w:type="dxa" w:w="794"/>
+            <w:tcW w:type="dxa" w:w="635"/>
             <w:shd w:val="clear" w:color="auto" w:fill="DCF3E4"/>
           </w:tcPr>
           <w:p/>
         </w:tc>
         <w:tc>
           <w:tcPr>
-            <w:tcW w:type="dxa" w:w="794"/>
+            <w:tcW w:type="dxa" w:w="635"/>
             <w:shd w:val="clear" w:color="auto" w:fill="DCF3E4"/>
-          </w:tcPr>
-          <w:p/>
-        </w:tc>
-        <w:tc>
-          <w:tcPr>
-            <w:tcW w:type="dxa" w:w="1814"/>
           </w:tcPr>
           <w:p/>
         </w:tc>
       </w:tr>
       <w:tr>
         <w:trPr>
-          <w:trHeight w:val="283" w:hRule="atLeast"/>
+          <w:trHeight w:val="295" w:hRule="atLeast"/>
         </w:trPr>
         <w:tc>
           <w:tcPr>
-            <w:tcW w:type="dxa" w:w="454"/>
+            <w:tcW w:type="dxa" w:w="397"/>
             <w:vAlign w:val="center"/>
           </w:tcPr>
           <w:p>
@@ -3127,96 +2977,90 @@
         </w:tc>
         <w:tc>
           <w:tcPr>
-            <w:tcW w:type="dxa" w:w="2608"/>
-          </w:tcPr>
-          <w:p/>
-        </w:tc>
-        <w:tc>
-          <w:tcPr>
-            <w:tcW w:type="dxa" w:w="794"/>
-          </w:tcPr>
-          <w:p/>
-        </w:tc>
-        <w:tc>
-          <w:tcPr>
-            <w:tcW w:type="dxa" w:w="794"/>
-          </w:tcPr>
-          <w:p/>
-        </w:tc>
-        <w:tc>
-          <w:tcPr>
-            <w:tcW w:type="dxa" w:w="794"/>
-          </w:tcPr>
-          <w:p/>
-        </w:tc>
-        <w:tc>
-          <w:tcPr>
-            <w:tcW w:type="dxa" w:w="794"/>
-          </w:tcPr>
-          <w:p/>
-        </w:tc>
-        <w:tc>
-          <w:tcPr>
-            <w:tcW w:type="dxa" w:w="794"/>
-          </w:tcPr>
-          <w:p/>
-        </w:tc>
-        <w:tc>
-          <w:tcPr>
-            <w:tcW w:type="dxa" w:w="794"/>
-          </w:tcPr>
-          <w:p/>
-        </w:tc>
-        <w:tc>
-          <w:tcPr>
-            <w:tcW w:type="dxa" w:w="794"/>
-          </w:tcPr>
-          <w:p/>
-        </w:tc>
-        <w:tc>
-          <w:tcPr>
-            <w:tcW w:type="dxa" w:w="794"/>
-          </w:tcPr>
-          <w:p/>
-        </w:tc>
-        <w:tc>
-          <w:tcPr>
-            <w:tcW w:type="dxa" w:w="794"/>
-          </w:tcPr>
-          <w:p/>
-        </w:tc>
-        <w:tc>
-          <w:tcPr>
-            <w:tcW w:type="dxa" w:w="794"/>
-          </w:tcPr>
-          <w:p/>
-        </w:tc>
-        <w:tc>
-          <w:tcPr>
-            <w:tcW w:type="dxa" w:w="794"/>
-          </w:tcPr>
-          <w:p/>
-        </w:tc>
-        <w:tc>
-          <w:tcPr>
-            <w:tcW w:type="dxa" w:w="794"/>
-          </w:tcPr>
-          <w:p/>
-        </w:tc>
-        <w:tc>
-          <w:tcPr>
-            <w:tcW w:type="dxa" w:w="1814"/>
+            <w:tcW w:type="dxa" w:w="2778"/>
+          </w:tcPr>
+          <w:p/>
+        </w:tc>
+        <w:tc>
+          <w:tcPr>
+            <w:tcW w:type="dxa" w:w="635"/>
+          </w:tcPr>
+          <w:p/>
+        </w:tc>
+        <w:tc>
+          <w:tcPr>
+            <w:tcW w:type="dxa" w:w="635"/>
+          </w:tcPr>
+          <w:p/>
+        </w:tc>
+        <w:tc>
+          <w:tcPr>
+            <w:tcW w:type="dxa" w:w="635"/>
+          </w:tcPr>
+          <w:p/>
+        </w:tc>
+        <w:tc>
+          <w:tcPr>
+            <w:tcW w:type="dxa" w:w="635"/>
+          </w:tcPr>
+          <w:p/>
+        </w:tc>
+        <w:tc>
+          <w:tcPr>
+            <w:tcW w:type="dxa" w:w="635"/>
+          </w:tcPr>
+          <w:p/>
+        </w:tc>
+        <w:tc>
+          <w:tcPr>
+            <w:tcW w:type="dxa" w:w="635"/>
+          </w:tcPr>
+          <w:p/>
+        </w:tc>
+        <w:tc>
+          <w:tcPr>
+            <w:tcW w:type="dxa" w:w="635"/>
+          </w:tcPr>
+          <w:p/>
+        </w:tc>
+        <w:tc>
+          <w:tcPr>
+            <w:tcW w:type="dxa" w:w="635"/>
+          </w:tcPr>
+          <w:p/>
+        </w:tc>
+        <w:tc>
+          <w:tcPr>
+            <w:tcW w:type="dxa" w:w="635"/>
+          </w:tcPr>
+          <w:p/>
+        </w:tc>
+        <w:tc>
+          <w:tcPr>
+            <w:tcW w:type="dxa" w:w="635"/>
+          </w:tcPr>
+          <w:p/>
+        </w:tc>
+        <w:tc>
+          <w:tcPr>
+            <w:tcW w:type="dxa" w:w="635"/>
+          </w:tcPr>
+          <w:p/>
+        </w:tc>
+        <w:tc>
+          <w:tcPr>
+            <w:tcW w:type="dxa" w:w="635"/>
           </w:tcPr>
           <w:p/>
         </w:tc>
       </w:tr>
       <w:tr>
         <w:trPr>
-          <w:trHeight w:val="283" w:hRule="atLeast"/>
+          <w:trHeight w:val="295" w:hRule="atLeast"/>
         </w:trPr>
         <w:tc>
           <w:tcPr>
-            <w:tcW w:type="dxa" w:w="454"/>
+            <w:tcW w:type="dxa" w:w="397"/>
             <w:vAlign w:val="center"/>
           </w:tcPr>
           <w:p>
@@ -3235,108 +3079,102 @@
         </w:tc>
         <w:tc>
           <w:tcPr>
-            <w:tcW w:type="dxa" w:w="2608"/>
-          </w:tcPr>
-          <w:p/>
-        </w:tc>
-        <w:tc>
-          <w:tcPr>
-            <w:tcW w:type="dxa" w:w="794"/>
+            <w:tcW w:type="dxa" w:w="2778"/>
+          </w:tcPr>
+          <w:p/>
+        </w:tc>
+        <w:tc>
+          <w:tcPr>
+            <w:tcW w:type="dxa" w:w="635"/>
             <w:shd w:val="clear" w:color="auto" w:fill="FDE2E2"/>
           </w:tcPr>
           <w:p/>
         </w:tc>
         <w:tc>
           <w:tcPr>
-            <w:tcW w:type="dxa" w:w="794"/>
+            <w:tcW w:type="dxa" w:w="635"/>
             <w:shd w:val="clear" w:color="auto" w:fill="FDE2E2"/>
           </w:tcPr>
           <w:p/>
         </w:tc>
         <w:tc>
           <w:tcPr>
-            <w:tcW w:type="dxa" w:w="794"/>
+            <w:tcW w:type="dxa" w:w="635"/>
             <w:shd w:val="clear" w:color="auto" w:fill="FDE2E2"/>
           </w:tcPr>
           <w:p/>
         </w:tc>
         <w:tc>
           <w:tcPr>
-            <w:tcW w:type="dxa" w:w="794"/>
+            <w:tcW w:type="dxa" w:w="635"/>
             <w:shd w:val="clear" w:color="auto" w:fill="FEF6D0"/>
           </w:tcPr>
           <w:p/>
         </w:tc>
         <w:tc>
           <w:tcPr>
-            <w:tcW w:type="dxa" w:w="794"/>
+            <w:tcW w:type="dxa" w:w="635"/>
             <w:shd w:val="clear" w:color="auto" w:fill="FEF6D0"/>
           </w:tcPr>
           <w:p/>
         </w:tc>
         <w:tc>
           <w:tcPr>
-            <w:tcW w:type="dxa" w:w="794"/>
+            <w:tcW w:type="dxa" w:w="635"/>
             <w:shd w:val="clear" w:color="auto" w:fill="FEF6D0"/>
           </w:tcPr>
           <w:p/>
         </w:tc>
         <w:tc>
           <w:tcPr>
-            <w:tcW w:type="dxa" w:w="794"/>
+            <w:tcW w:type="dxa" w:w="635"/>
             <w:shd w:val="clear" w:color="auto" w:fill="DCE7FD"/>
           </w:tcPr>
           <w:p/>
         </w:tc>
         <w:tc>
           <w:tcPr>
-            <w:tcW w:type="dxa" w:w="794"/>
+            <w:tcW w:type="dxa" w:w="635"/>
             <w:shd w:val="clear" w:color="auto" w:fill="DCE7FD"/>
           </w:tcPr>
           <w:p/>
         </w:tc>
         <w:tc>
           <w:tcPr>
-            <w:tcW w:type="dxa" w:w="794"/>
+            <w:tcW w:type="dxa" w:w="635"/>
             <w:shd w:val="clear" w:color="auto" w:fill="DCE7FD"/>
           </w:tcPr>
           <w:p/>
         </w:tc>
         <w:tc>
           <w:tcPr>
-            <w:tcW w:type="dxa" w:w="794"/>
+            <w:tcW w:type="dxa" w:w="635"/>
             <w:shd w:val="clear" w:color="auto" w:fill="DCF3E4"/>
           </w:tcPr>
           <w:p/>
         </w:tc>
         <w:tc>
           <w:tcPr>
-            <w:tcW w:type="dxa" w:w="794"/>
+            <w:tcW w:type="dxa" w:w="635"/>
             <w:shd w:val="clear" w:color="auto" w:fill="DCF3E4"/>
           </w:tcPr>
           <w:p/>
         </w:tc>
         <w:tc>
           <w:tcPr>
-            <w:tcW w:type="dxa" w:w="794"/>
+            <w:tcW w:type="dxa" w:w="635"/>
             <w:shd w:val="clear" w:color="auto" w:fill="DCF3E4"/>
-          </w:tcPr>
-          <w:p/>
-        </w:tc>
-        <w:tc>
-          <w:tcPr>
-            <w:tcW w:type="dxa" w:w="1814"/>
           </w:tcPr>
           <w:p/>
         </w:tc>
       </w:tr>
       <w:tr>
         <w:trPr>
-          <w:trHeight w:val="283" w:hRule="atLeast"/>
+          <w:trHeight w:val="295" w:hRule="atLeast"/>
         </w:trPr>
         <w:tc>
           <w:tcPr>
-            <w:tcW w:type="dxa" w:w="454"/>
+            <w:tcW w:type="dxa" w:w="397"/>
             <w:vAlign w:val="center"/>
           </w:tcPr>
           <w:p>
@@ -3355,96 +3193,90 @@
         </w:tc>
         <w:tc>
           <w:tcPr>
-            <w:tcW w:type="dxa" w:w="2608"/>
-          </w:tcPr>
-          <w:p/>
-        </w:tc>
-        <w:tc>
-          <w:tcPr>
-            <w:tcW w:type="dxa" w:w="794"/>
-          </w:tcPr>
-          <w:p/>
-        </w:tc>
-        <w:tc>
-          <w:tcPr>
-            <w:tcW w:type="dxa" w:w="794"/>
-          </w:tcPr>
-          <w:p/>
-        </w:tc>
-        <w:tc>
-          <w:tcPr>
-            <w:tcW w:type="dxa" w:w="794"/>
-          </w:tcPr>
-          <w:p/>
-        </w:tc>
-        <w:tc>
-          <w:tcPr>
-            <w:tcW w:type="dxa" w:w="794"/>
-          </w:tcPr>
-          <w:p/>
-        </w:tc>
-        <w:tc>
-          <w:tcPr>
-            <w:tcW w:type="dxa" w:w="794"/>
-          </w:tcPr>
-          <w:p/>
-        </w:tc>
-        <w:tc>
-          <w:tcPr>
-            <w:tcW w:type="dxa" w:w="794"/>
-          </w:tcPr>
-          <w:p/>
-        </w:tc>
-        <w:tc>
-          <w:tcPr>
-            <w:tcW w:type="dxa" w:w="794"/>
-          </w:tcPr>
-          <w:p/>
-        </w:tc>
-        <w:tc>
-          <w:tcPr>
-            <w:tcW w:type="dxa" w:w="794"/>
-          </w:tcPr>
-          <w:p/>
-        </w:tc>
-        <w:tc>
-          <w:tcPr>
-            <w:tcW w:type="dxa" w:w="794"/>
-          </w:tcPr>
-          <w:p/>
-        </w:tc>
-        <w:tc>
-          <w:tcPr>
-            <w:tcW w:type="dxa" w:w="794"/>
-          </w:tcPr>
-          <w:p/>
-        </w:tc>
-        <w:tc>
-          <w:tcPr>
-            <w:tcW w:type="dxa" w:w="794"/>
-          </w:tcPr>
-          <w:p/>
-        </w:tc>
-        <w:tc>
-          <w:tcPr>
-            <w:tcW w:type="dxa" w:w="794"/>
-          </w:tcPr>
-          <w:p/>
-        </w:tc>
-        <w:tc>
-          <w:tcPr>
-            <w:tcW w:type="dxa" w:w="1814"/>
+            <w:tcW w:type="dxa" w:w="2778"/>
+          </w:tcPr>
+          <w:p/>
+        </w:tc>
+        <w:tc>
+          <w:tcPr>
+            <w:tcW w:type="dxa" w:w="635"/>
+          </w:tcPr>
+          <w:p/>
+        </w:tc>
+        <w:tc>
+          <w:tcPr>
+            <w:tcW w:type="dxa" w:w="635"/>
+          </w:tcPr>
+          <w:p/>
+        </w:tc>
+        <w:tc>
+          <w:tcPr>
+            <w:tcW w:type="dxa" w:w="635"/>
+          </w:tcPr>
+          <w:p/>
+        </w:tc>
+        <w:tc>
+          <w:tcPr>
+            <w:tcW w:type="dxa" w:w="635"/>
+          </w:tcPr>
+          <w:p/>
+        </w:tc>
+        <w:tc>
+          <w:tcPr>
+            <w:tcW w:type="dxa" w:w="635"/>
+          </w:tcPr>
+          <w:p/>
+        </w:tc>
+        <w:tc>
+          <w:tcPr>
+            <w:tcW w:type="dxa" w:w="635"/>
+          </w:tcPr>
+          <w:p/>
+        </w:tc>
+        <w:tc>
+          <w:tcPr>
+            <w:tcW w:type="dxa" w:w="635"/>
+          </w:tcPr>
+          <w:p/>
+        </w:tc>
+        <w:tc>
+          <w:tcPr>
+            <w:tcW w:type="dxa" w:w="635"/>
+          </w:tcPr>
+          <w:p/>
+        </w:tc>
+        <w:tc>
+          <w:tcPr>
+            <w:tcW w:type="dxa" w:w="635"/>
+          </w:tcPr>
+          <w:p/>
+        </w:tc>
+        <w:tc>
+          <w:tcPr>
+            <w:tcW w:type="dxa" w:w="635"/>
+          </w:tcPr>
+          <w:p/>
+        </w:tc>
+        <w:tc>
+          <w:tcPr>
+            <w:tcW w:type="dxa" w:w="635"/>
+          </w:tcPr>
+          <w:p/>
+        </w:tc>
+        <w:tc>
+          <w:tcPr>
+            <w:tcW w:type="dxa" w:w="635"/>
           </w:tcPr>
           <w:p/>
         </w:tc>
       </w:tr>
       <w:tr>
         <w:trPr>
-          <w:trHeight w:val="283" w:hRule="atLeast"/>
+          <w:trHeight w:val="295" w:hRule="atLeast"/>
         </w:trPr>
         <w:tc>
           <w:tcPr>
-            <w:tcW w:type="dxa" w:w="454"/>
+            <w:tcW w:type="dxa" w:w="397"/>
             <w:vAlign w:val="center"/>
           </w:tcPr>
           <w:p>
@@ -3463,108 +3295,102 @@
         </w:tc>
         <w:tc>
           <w:tcPr>
-            <w:tcW w:type="dxa" w:w="2608"/>
-          </w:tcPr>
-          <w:p/>
-        </w:tc>
-        <w:tc>
-          <w:tcPr>
-            <w:tcW w:type="dxa" w:w="794"/>
+            <w:tcW w:type="dxa" w:w="2778"/>
+          </w:tcPr>
+          <w:p/>
+        </w:tc>
+        <w:tc>
+          <w:tcPr>
+            <w:tcW w:type="dxa" w:w="635"/>
             <w:shd w:val="clear" w:color="auto" w:fill="FDE2E2"/>
           </w:tcPr>
           <w:p/>
         </w:tc>
         <w:tc>
           <w:tcPr>
-            <w:tcW w:type="dxa" w:w="794"/>
+            <w:tcW w:type="dxa" w:w="635"/>
             <w:shd w:val="clear" w:color="auto" w:fill="FDE2E2"/>
           </w:tcPr>
           <w:p/>
         </w:tc>
         <w:tc>
           <w:tcPr>
-            <w:tcW w:type="dxa" w:w="794"/>
+            <w:tcW w:type="dxa" w:w="635"/>
             <w:shd w:val="clear" w:color="auto" w:fill="FDE2E2"/>
           </w:tcPr>
           <w:p/>
         </w:tc>
         <w:tc>
           <w:tcPr>
-            <w:tcW w:type="dxa" w:w="794"/>
+            <w:tcW w:type="dxa" w:w="635"/>
             <w:shd w:val="clear" w:color="auto" w:fill="FEF6D0"/>
           </w:tcPr>
           <w:p/>
         </w:tc>
         <w:tc>
           <w:tcPr>
-            <w:tcW w:type="dxa" w:w="794"/>
+            <w:tcW w:type="dxa" w:w="635"/>
             <w:shd w:val="clear" w:color="auto" w:fill="FEF6D0"/>
           </w:tcPr>
           <w:p/>
         </w:tc>
         <w:tc>
           <w:tcPr>
-            <w:tcW w:type="dxa" w:w="794"/>
+            <w:tcW w:type="dxa" w:w="635"/>
             <w:shd w:val="clear" w:color="auto" w:fill="FEF6D0"/>
           </w:tcPr>
           <w:p/>
         </w:tc>
         <w:tc>
           <w:tcPr>
-            <w:tcW w:type="dxa" w:w="794"/>
+            <w:tcW w:type="dxa" w:w="635"/>
             <w:shd w:val="clear" w:color="auto" w:fill="DCE7FD"/>
           </w:tcPr>
           <w:p/>
         </w:tc>
         <w:tc>
           <w:tcPr>
-            <w:tcW w:type="dxa" w:w="794"/>
+            <w:tcW w:type="dxa" w:w="635"/>
             <w:shd w:val="clear" w:color="auto" w:fill="DCE7FD"/>
           </w:tcPr>
           <w:p/>
         </w:tc>
         <w:tc>
           <w:tcPr>
-            <w:tcW w:type="dxa" w:w="794"/>
+            <w:tcW w:type="dxa" w:w="635"/>
             <w:shd w:val="clear" w:color="auto" w:fill="DCE7FD"/>
           </w:tcPr>
           <w:p/>
         </w:tc>
         <w:tc>
           <w:tcPr>
-            <w:tcW w:type="dxa" w:w="794"/>
+            <w:tcW w:type="dxa" w:w="635"/>
             <w:shd w:val="clear" w:color="auto" w:fill="DCF3E4"/>
           </w:tcPr>
           <w:p/>
         </w:tc>
         <w:tc>
           <w:tcPr>
-            <w:tcW w:type="dxa" w:w="794"/>
+            <w:tcW w:type="dxa" w:w="635"/>
             <w:shd w:val="clear" w:color="auto" w:fill="DCF3E4"/>
           </w:tcPr>
           <w:p/>
         </w:tc>
         <w:tc>
           <w:tcPr>
-            <w:tcW w:type="dxa" w:w="794"/>
+            <w:tcW w:type="dxa" w:w="635"/>
             <w:shd w:val="clear" w:color="auto" w:fill="DCF3E4"/>
-          </w:tcPr>
-          <w:p/>
-        </w:tc>
-        <w:tc>
-          <w:tcPr>
-            <w:tcW w:type="dxa" w:w="1814"/>
           </w:tcPr>
           <w:p/>
         </w:tc>
       </w:tr>
       <w:tr>
         <w:trPr>
-          <w:trHeight w:val="283" w:hRule="atLeast"/>
+          <w:trHeight w:val="295" w:hRule="atLeast"/>
         </w:trPr>
         <w:tc>
           <w:tcPr>
-            <w:tcW w:type="dxa" w:w="454"/>
+            <w:tcW w:type="dxa" w:w="397"/>
             <w:vAlign w:val="center"/>
           </w:tcPr>
           <w:p>
@@ -3583,85 +3409,79 @@
         </w:tc>
         <w:tc>
           <w:tcPr>
-            <w:tcW w:type="dxa" w:w="2608"/>
-          </w:tcPr>
-          <w:p/>
-        </w:tc>
-        <w:tc>
-          <w:tcPr>
-            <w:tcW w:type="dxa" w:w="794"/>
-          </w:tcPr>
-          <w:p/>
-        </w:tc>
-        <w:tc>
-          <w:tcPr>
-            <w:tcW w:type="dxa" w:w="794"/>
-          </w:tcPr>
-          <w:p/>
-        </w:tc>
-        <w:tc>
-          <w:tcPr>
-            <w:tcW w:type="dxa" w:w="794"/>
-          </w:tcPr>
-          <w:p/>
-        </w:tc>
-        <w:tc>
-          <w:tcPr>
-            <w:tcW w:type="dxa" w:w="794"/>
-          </w:tcPr>
-          <w:p/>
-        </w:tc>
-        <w:tc>
-          <w:tcPr>
-            <w:tcW w:type="dxa" w:w="794"/>
-          </w:tcPr>
-          <w:p/>
-        </w:tc>
-        <w:tc>
-          <w:tcPr>
-            <w:tcW w:type="dxa" w:w="794"/>
-          </w:tcPr>
-          <w:p/>
-        </w:tc>
-        <w:tc>
-          <w:tcPr>
-            <w:tcW w:type="dxa" w:w="794"/>
-          </w:tcPr>
-          <w:p/>
-        </w:tc>
-        <w:tc>
-          <w:tcPr>
-            <w:tcW w:type="dxa" w:w="794"/>
-          </w:tcPr>
-          <w:p/>
-        </w:tc>
-        <w:tc>
-          <w:tcPr>
-            <w:tcW w:type="dxa" w:w="794"/>
-          </w:tcPr>
-          <w:p/>
-        </w:tc>
-        <w:tc>
-          <w:tcPr>
-            <w:tcW w:type="dxa" w:w="794"/>
-          </w:tcPr>
-          <w:p/>
-        </w:tc>
-        <w:tc>
-          <w:tcPr>
-            <w:tcW w:type="dxa" w:w="794"/>
-          </w:tcPr>
-          <w:p/>
-        </w:tc>
-        <w:tc>
-          <w:tcPr>
-            <w:tcW w:type="dxa" w:w="794"/>
-          </w:tcPr>
-          <w:p/>
-        </w:tc>
-        <w:tc>
-          <w:tcPr>
-            <w:tcW w:type="dxa" w:w="1814"/>
+            <w:tcW w:type="dxa" w:w="2778"/>
+          </w:tcPr>
+          <w:p/>
+        </w:tc>
+        <w:tc>
+          <w:tcPr>
+            <w:tcW w:type="dxa" w:w="635"/>
+          </w:tcPr>
+          <w:p/>
+        </w:tc>
+        <w:tc>
+          <w:tcPr>
+            <w:tcW w:type="dxa" w:w="635"/>
+          </w:tcPr>
+          <w:p/>
+        </w:tc>
+        <w:tc>
+          <w:tcPr>
+            <w:tcW w:type="dxa" w:w="635"/>
+          </w:tcPr>
+          <w:p/>
+        </w:tc>
+        <w:tc>
+          <w:tcPr>
+            <w:tcW w:type="dxa" w:w="635"/>
+          </w:tcPr>
+          <w:p/>
+        </w:tc>
+        <w:tc>
+          <w:tcPr>
+            <w:tcW w:type="dxa" w:w="635"/>
+          </w:tcPr>
+          <w:p/>
+        </w:tc>
+        <w:tc>
+          <w:tcPr>
+            <w:tcW w:type="dxa" w:w="635"/>
+          </w:tcPr>
+          <w:p/>
+        </w:tc>
+        <w:tc>
+          <w:tcPr>
+            <w:tcW w:type="dxa" w:w="635"/>
+          </w:tcPr>
+          <w:p/>
+        </w:tc>
+        <w:tc>
+          <w:tcPr>
+            <w:tcW w:type="dxa" w:w="635"/>
+          </w:tcPr>
+          <w:p/>
+        </w:tc>
+        <w:tc>
+          <w:tcPr>
+            <w:tcW w:type="dxa" w:w="635"/>
+          </w:tcPr>
+          <w:p/>
+        </w:tc>
+        <w:tc>
+          <w:tcPr>
+            <w:tcW w:type="dxa" w:w="635"/>
+          </w:tcPr>
+          <w:p/>
+        </w:tc>
+        <w:tc>
+          <w:tcPr>
+            <w:tcW w:type="dxa" w:w="635"/>
+          </w:tcPr>
+          <w:p/>
+        </w:tc>
+        <w:tc>
+          <w:tcPr>
+            <w:tcW w:type="dxa" w:w="635"/>
           </w:tcPr>
           <w:p/>
         </w:tc>
@@ -3669,33 +3489,788 @@
     </w:tbl>
     <w:p>
       <w:pPr>
-        <w:spacing w:after="40"/>
+        <w:spacing w:after="20"/>
         <w:jc w:val="left"/>
       </w:pPr>
       <w:r>
         <w:rPr>
           <w:b/>
-          <w:sz w:val="20"/>
+          <w:sz w:val="18"/>
         </w:rPr>
-        <w:t>Тэмдэглэгээ:   ✔ — өнгийг таньсан (зааж/нэрлэж/ялгаж чадсан)     △ — тусламжтайгаар таньсан     ○ — таниагүй</w:t>
+        <w:t>Тэмдэглэгээ:  ✔ — таньсан (зааж/нэрлэж/ялгаж чадсан)   △ — тусламжтайгаар таньсан   ○ — таниагүй</w:t>
       </w:r>
     </w:p>
     <w:p>
       <w:pPr>
-        <w:spacing w:after="0"/>
+        <w:spacing w:after="120"/>
         <w:jc w:val="left"/>
       </w:pPr>
       <w:r>
         <w:rPr>
           <w:b w:val="0"/>
-          <w:sz w:val="18"/>
+          <w:sz w:val="16"/>
         </w:rPr>
-        <w:t>Заавар: Өнгө бүрийг сарын турш 3 удаа ажиглана. Ажигласан өдрийн огноог «__/__» хэсэгт бичээд, хүүхэд бүрийн нүдэнд тэмдэглэгээ тавина. Жишээ нь «Улаан өнгийг зааж өгөөч», «Энэ ямар өнгөтэй вэ?», «Шар бөмбөгийг шар сагсанд хийгээрэй» гэх мэт.</w:t>
+        <w:t>Өнгө бүрийг сарын турш 3 удаа ажиглаж, огноог «__/__» хэсэгт бичнэ. Жишээ асуулт: «Улаан өнгийг зааж өгөөч», «Энэ ямар өнгөтэй вэ?», «Шар бөмбөгийг шар сагсанд хийгээрэй».</w:t>
+      </w:r>
+    </w:p>
+    <w:p>
+      <w:pPr>
+        <w:spacing w:after="60"/>
+        <w:jc w:val="center"/>
+      </w:pPr>
+      <w:r>
+        <w:rPr>
+          <w:b/>
+          <w:color w:val="1E6B52"/>
+          <w:sz w:val="22"/>
+        </w:rPr>
+        <w:t>НЭГТГЭЛ  (3-р буюу сүүлийн ажиглалтын дүнгээр)</w:t>
+      </w:r>
+    </w:p>
+    <w:tbl>
+      <w:tblPr>
+        <w:tblStyle w:val="TableGrid"/>
+        <w:tblW w:type="auto" w:w="0"/>
+        <w:jc w:val="center"/>
+        <w:tblLayout w:type="fixed"/>
+        <w:tblLook w:firstColumn="1" w:firstRow="1" w:lastColumn="0" w:lastRow="0" w:noHBand="0" w:noVBand="1" w:val="04A0"/>
+      </w:tblPr>
+      <w:tblGrid>
+        <w:gridCol w:w="1814"/>
+        <w:gridCol w:w="1077"/>
+        <w:gridCol w:w="1191"/>
+        <w:gridCol w:w="1077"/>
+        <w:gridCol w:w="1077"/>
+        <w:gridCol w:w="1077"/>
+        <w:gridCol w:w="3458"/>
+      </w:tblGrid>
+      <w:tr>
+        <w:trPr>
+          <w:trHeight w:val="510" w:hRule="atLeast"/>
+        </w:trPr>
+        <w:tc>
+          <w:tcPr>
+            <w:tcW w:type="dxa" w:w="1814"/>
+            <w:vAlign w:val="center"/>
+            <w:shd w:val="clear" w:color="auto" w:fill="D9EAD3"/>
+          </w:tcPr>
+          <w:p>
+            <w:pPr>
+              <w:spacing w:after="0" w:before="0"/>
+              <w:jc w:val="center"/>
+            </w:pPr>
+            <w:r/>
+            <w:r>
+              <w:rPr>
+                <w:b/>
+                <w:sz w:val="16"/>
+              </w:rPr>
+              <w:t>Өнгө</w:t>
+            </w:r>
+          </w:p>
+        </w:tc>
+        <w:tc>
+          <w:tcPr>
+            <w:tcW w:type="dxa" w:w="1077"/>
+            <w:vAlign w:val="center"/>
+            <w:shd w:val="clear" w:color="auto" w:fill="D9EAD3"/>
+          </w:tcPr>
+          <w:p>
+            <w:pPr>
+              <w:spacing w:after="0" w:before="0"/>
+              <w:jc w:val="center"/>
+            </w:pPr>
+            <w:r/>
+            <w:r>
+              <w:rPr>
+                <w:b/>
+                <w:sz w:val="16"/>
+              </w:rPr>
+              <w:t>✔ Таньсан</w:t>
+              <w:br/>
+              <w:t>(тоо)</w:t>
+            </w:r>
+          </w:p>
+        </w:tc>
+        <w:tc>
+          <w:tcPr>
+            <w:tcW w:type="dxa" w:w="1191"/>
+            <w:vAlign w:val="center"/>
+            <w:shd w:val="clear" w:color="auto" w:fill="D9EAD3"/>
+          </w:tcPr>
+          <w:p>
+            <w:pPr>
+              <w:spacing w:after="0" w:before="0"/>
+              <w:jc w:val="center"/>
+            </w:pPr>
+            <w:r/>
+            <w:r>
+              <w:rPr>
+                <w:b/>
+                <w:sz w:val="16"/>
+              </w:rPr>
+              <w:t>△ Тусламжтай</w:t>
+              <w:br/>
+              <w:t>(тоо)</w:t>
+            </w:r>
+          </w:p>
+        </w:tc>
+        <w:tc>
+          <w:tcPr>
+            <w:tcW w:type="dxa" w:w="1077"/>
+            <w:vAlign w:val="center"/>
+            <w:shd w:val="clear" w:color="auto" w:fill="D9EAD3"/>
+          </w:tcPr>
+          <w:p>
+            <w:pPr>
+              <w:spacing w:after="0" w:before="0"/>
+              <w:jc w:val="center"/>
+            </w:pPr>
+            <w:r/>
+            <w:r>
+              <w:rPr>
+                <w:b/>
+                <w:sz w:val="16"/>
+              </w:rPr>
+              <w:t>○ Таниагүй</w:t>
+              <w:br/>
+              <w:t>(тоо)</w:t>
+            </w:r>
+          </w:p>
+        </w:tc>
+        <w:tc>
+          <w:tcPr>
+            <w:tcW w:type="dxa" w:w="1077"/>
+            <w:vAlign w:val="center"/>
+            <w:shd w:val="clear" w:color="auto" w:fill="D9EAD3"/>
+          </w:tcPr>
+          <w:p>
+            <w:pPr>
+              <w:spacing w:after="0" w:before="0"/>
+              <w:jc w:val="center"/>
+            </w:pPr>
+            <w:r/>
+            <w:r>
+              <w:rPr>
+                <w:b/>
+                <w:sz w:val="16"/>
+              </w:rPr>
+              <w:t>Ажигласан</w:t>
+              <w:br/>
+              <w:t>хүүхэд</w:t>
+            </w:r>
+          </w:p>
+        </w:tc>
+        <w:tc>
+          <w:tcPr>
+            <w:tcW w:type="dxa" w:w="1077"/>
+            <w:vAlign w:val="center"/>
+            <w:shd w:val="clear" w:color="auto" w:fill="D9EAD3"/>
+          </w:tcPr>
+          <w:p>
+            <w:pPr>
+              <w:spacing w:after="0" w:before="0"/>
+              <w:jc w:val="center"/>
+            </w:pPr>
+            <w:r/>
+            <w:r>
+              <w:rPr>
+                <w:b/>
+                <w:sz w:val="16"/>
+              </w:rPr>
+              <w:t>Таньсан</w:t>
+              <w:br/>
+              <w:t>хувь (%)</w:t>
+            </w:r>
+          </w:p>
+        </w:tc>
+        <w:tc>
+          <w:tcPr>
+            <w:tcW w:type="dxa" w:w="3458"/>
+            <w:vAlign w:val="center"/>
+            <w:shd w:val="clear" w:color="auto" w:fill="D9EAD3"/>
+          </w:tcPr>
+          <w:p>
+            <w:pPr>
+              <w:spacing w:after="0" w:before="0"/>
+              <w:jc w:val="center"/>
+            </w:pPr>
+            <w:r/>
+            <w:r>
+              <w:rPr>
+                <w:b/>
+                <w:sz w:val="16"/>
+              </w:rPr>
+              <w:t>Дүгнэлт / цаашид анхаарах</w:t>
+            </w:r>
+          </w:p>
+        </w:tc>
+      </w:tr>
+      <w:tr>
+        <w:trPr>
+          <w:trHeight w:val="482" w:hRule="atLeast"/>
+        </w:trPr>
+        <w:tc>
+          <w:tcPr>
+            <w:tcW w:type="dxa" w:w="1814"/>
+            <w:shd w:val="clear" w:color="auto" w:fill="FDE2E2"/>
+            <w:vAlign w:val="center"/>
+          </w:tcPr>
+          <w:p>
+            <w:pPr>
+              <w:spacing w:after="0"/>
+              <w:jc w:val="left"/>
+            </w:pPr>
+            <w:r/>
+            <w:r>
+              <w:drawing>
+                <wp:inline xmlns:a="http://schemas.openxmlformats.org/drawingml/2006/main" xmlns:pic="http://schemas.openxmlformats.org/drawingml/2006/picture">
+                  <wp:extent cx="270000" cy="270000"/>
+                  <wp:docPr id="5" name="Picture 5"/>
+                  <wp:cNvGraphicFramePr>
+                    <a:graphicFrameLocks noChangeAspect="1"/>
+                  </wp:cNvGraphicFramePr>
+                  <a:graphic>
+                    <a:graphicData uri="http://schemas.openxmlformats.org/drawingml/2006/picture">
+                      <pic:pic>
+                        <pic:nvPicPr>
+                          <pic:cNvPr id="0" name="ulaan.png"/>
+                          <pic:cNvPicPr/>
+                        </pic:nvPicPr>
+                        <pic:blipFill>
+                          <a:blip r:embed="rId9"/>
+                          <a:stretch>
+                            <a:fillRect/>
+                          </a:stretch>
+                        </pic:blipFill>
+                        <pic:spPr>
+                          <a:xfrm>
+                            <a:off x="0" y="0"/>
+                            <a:ext cx="270000" cy="270000"/>
+                          </a:xfrm>
+                          <a:prstGeom prst="rect"/>
+                        </pic:spPr>
+                      </pic:pic>
+                    </a:graphicData>
+                  </a:graphic>
+                </wp:inline>
+              </w:drawing>
+            </w:r>
+            <w:r>
+              <w:rPr>
+                <w:b/>
+                <w:sz w:val="18"/>
+              </w:rPr>
+              <w:t xml:space="preserve">  Улаан</w:t>
+            </w:r>
+          </w:p>
+        </w:tc>
+        <w:tc>
+          <w:tcPr>
+            <w:tcW w:type="dxa" w:w="1077"/>
+          </w:tcPr>
+          <w:p/>
+        </w:tc>
+        <w:tc>
+          <w:tcPr>
+            <w:tcW w:type="dxa" w:w="1191"/>
+          </w:tcPr>
+          <w:p/>
+        </w:tc>
+        <w:tc>
+          <w:tcPr>
+            <w:tcW w:type="dxa" w:w="1077"/>
+          </w:tcPr>
+          <w:p/>
+        </w:tc>
+        <w:tc>
+          <w:tcPr>
+            <w:tcW w:type="dxa" w:w="1077"/>
+          </w:tcPr>
+          <w:p/>
+        </w:tc>
+        <w:tc>
+          <w:tcPr>
+            <w:tcW w:type="dxa" w:w="1077"/>
+            <w:vAlign w:val="center"/>
+          </w:tcPr>
+          <w:p>
+            <w:pPr>
+              <w:spacing w:after="0" w:before="0"/>
+              <w:jc w:val="right"/>
+            </w:pPr>
+            <w:r>
+              <w:rPr>
+                <w:b w:val="0"/>
+                <w:color w:val="999999"/>
+                <w:sz w:val="16"/>
+              </w:rPr>
+              <w:t>%</w:t>
+            </w:r>
+          </w:p>
+        </w:tc>
+        <w:tc>
+          <w:tcPr>
+            <w:tcW w:type="dxa" w:w="3458"/>
+          </w:tcPr>
+          <w:p/>
+        </w:tc>
+      </w:tr>
+      <w:tr>
+        <w:trPr>
+          <w:trHeight w:val="482" w:hRule="atLeast"/>
+        </w:trPr>
+        <w:tc>
+          <w:tcPr>
+            <w:tcW w:type="dxa" w:w="1814"/>
+            <w:shd w:val="clear" w:color="auto" w:fill="FEF6D0"/>
+            <w:vAlign w:val="center"/>
+          </w:tcPr>
+          <w:p>
+            <w:pPr>
+              <w:spacing w:after="0"/>
+              <w:jc w:val="left"/>
+            </w:pPr>
+            <w:r/>
+            <w:r>
+              <w:drawing>
+                <wp:inline xmlns:a="http://schemas.openxmlformats.org/drawingml/2006/main" xmlns:pic="http://schemas.openxmlformats.org/drawingml/2006/picture">
+                  <wp:extent cx="270000" cy="270000"/>
+                  <wp:docPr id="6" name="Picture 6"/>
+                  <wp:cNvGraphicFramePr>
+                    <a:graphicFrameLocks noChangeAspect="1"/>
+                  </wp:cNvGraphicFramePr>
+                  <a:graphic>
+                    <a:graphicData uri="http://schemas.openxmlformats.org/drawingml/2006/picture">
+                      <pic:pic>
+                        <pic:nvPicPr>
+                          <pic:cNvPr id="0" name="shar.png"/>
+                          <pic:cNvPicPr/>
+                        </pic:nvPicPr>
+                        <pic:blipFill>
+                          <a:blip r:embed="rId10"/>
+                          <a:stretch>
+                            <a:fillRect/>
+                          </a:stretch>
+                        </pic:blipFill>
+                        <pic:spPr>
+                          <a:xfrm>
+                            <a:off x="0" y="0"/>
+                            <a:ext cx="270000" cy="270000"/>
+                          </a:xfrm>
+                          <a:prstGeom prst="rect"/>
+                        </pic:spPr>
+                      </pic:pic>
+                    </a:graphicData>
+                  </a:graphic>
+                </wp:inline>
+              </w:drawing>
+            </w:r>
+            <w:r>
+              <w:rPr>
+                <w:b/>
+                <w:sz w:val="18"/>
+              </w:rPr>
+              <w:t xml:space="preserve">  Шар</w:t>
+            </w:r>
+          </w:p>
+        </w:tc>
+        <w:tc>
+          <w:tcPr>
+            <w:tcW w:type="dxa" w:w="1077"/>
+          </w:tcPr>
+          <w:p/>
+        </w:tc>
+        <w:tc>
+          <w:tcPr>
+            <w:tcW w:type="dxa" w:w="1191"/>
+          </w:tcPr>
+          <w:p/>
+        </w:tc>
+        <w:tc>
+          <w:tcPr>
+            <w:tcW w:type="dxa" w:w="1077"/>
+          </w:tcPr>
+          <w:p/>
+        </w:tc>
+        <w:tc>
+          <w:tcPr>
+            <w:tcW w:type="dxa" w:w="1077"/>
+          </w:tcPr>
+          <w:p/>
+        </w:tc>
+        <w:tc>
+          <w:tcPr>
+            <w:tcW w:type="dxa" w:w="1077"/>
+            <w:vAlign w:val="center"/>
+          </w:tcPr>
+          <w:p>
+            <w:pPr>
+              <w:spacing w:after="0" w:before="0"/>
+              <w:jc w:val="right"/>
+            </w:pPr>
+            <w:r>
+              <w:rPr>
+                <w:b w:val="0"/>
+                <w:color w:val="999999"/>
+                <w:sz w:val="16"/>
+              </w:rPr>
+              <w:t>%</w:t>
+            </w:r>
+          </w:p>
+        </w:tc>
+        <w:tc>
+          <w:tcPr>
+            <w:tcW w:type="dxa" w:w="3458"/>
+          </w:tcPr>
+          <w:p/>
+        </w:tc>
+      </w:tr>
+      <w:tr>
+        <w:trPr>
+          <w:trHeight w:val="482" w:hRule="atLeast"/>
+        </w:trPr>
+        <w:tc>
+          <w:tcPr>
+            <w:tcW w:type="dxa" w:w="1814"/>
+            <w:shd w:val="clear" w:color="auto" w:fill="DCE7FD"/>
+            <w:vAlign w:val="center"/>
+          </w:tcPr>
+          <w:p>
+            <w:pPr>
+              <w:spacing w:after="0"/>
+              <w:jc w:val="left"/>
+            </w:pPr>
+            <w:r/>
+            <w:r>
+              <w:drawing>
+                <wp:inline xmlns:a="http://schemas.openxmlformats.org/drawingml/2006/main" xmlns:pic="http://schemas.openxmlformats.org/drawingml/2006/picture">
+                  <wp:extent cx="270000" cy="270000"/>
+                  <wp:docPr id="7" name="Picture 7"/>
+                  <wp:cNvGraphicFramePr>
+                    <a:graphicFrameLocks noChangeAspect="1"/>
+                  </wp:cNvGraphicFramePr>
+                  <a:graphic>
+                    <a:graphicData uri="http://schemas.openxmlformats.org/drawingml/2006/picture">
+                      <pic:pic>
+                        <pic:nvPicPr>
+                          <pic:cNvPr id="0" name="hoh.png"/>
+                          <pic:cNvPicPr/>
+                        </pic:nvPicPr>
+                        <pic:blipFill>
+                          <a:blip r:embed="rId11"/>
+                          <a:stretch>
+                            <a:fillRect/>
+                          </a:stretch>
+                        </pic:blipFill>
+                        <pic:spPr>
+                          <a:xfrm>
+                            <a:off x="0" y="0"/>
+                            <a:ext cx="270000" cy="270000"/>
+                          </a:xfrm>
+                          <a:prstGeom prst="rect"/>
+                        </pic:spPr>
+                      </pic:pic>
+                    </a:graphicData>
+                  </a:graphic>
+                </wp:inline>
+              </w:drawing>
+            </w:r>
+            <w:r>
+              <w:rPr>
+                <w:b/>
+                <w:sz w:val="18"/>
+              </w:rPr>
+              <w:t xml:space="preserve">  Хөх</w:t>
+            </w:r>
+          </w:p>
+        </w:tc>
+        <w:tc>
+          <w:tcPr>
+            <w:tcW w:type="dxa" w:w="1077"/>
+          </w:tcPr>
+          <w:p/>
+        </w:tc>
+        <w:tc>
+          <w:tcPr>
+            <w:tcW w:type="dxa" w:w="1191"/>
+          </w:tcPr>
+          <w:p/>
+        </w:tc>
+        <w:tc>
+          <w:tcPr>
+            <w:tcW w:type="dxa" w:w="1077"/>
+          </w:tcPr>
+          <w:p/>
+        </w:tc>
+        <w:tc>
+          <w:tcPr>
+            <w:tcW w:type="dxa" w:w="1077"/>
+          </w:tcPr>
+          <w:p/>
+        </w:tc>
+        <w:tc>
+          <w:tcPr>
+            <w:tcW w:type="dxa" w:w="1077"/>
+            <w:vAlign w:val="center"/>
+          </w:tcPr>
+          <w:p>
+            <w:pPr>
+              <w:spacing w:after="0" w:before="0"/>
+              <w:jc w:val="right"/>
+            </w:pPr>
+            <w:r>
+              <w:rPr>
+                <w:b w:val="0"/>
+                <w:color w:val="999999"/>
+                <w:sz w:val="16"/>
+              </w:rPr>
+              <w:t>%</w:t>
+            </w:r>
+          </w:p>
+        </w:tc>
+        <w:tc>
+          <w:tcPr>
+            <w:tcW w:type="dxa" w:w="3458"/>
+          </w:tcPr>
+          <w:p/>
+        </w:tc>
+      </w:tr>
+      <w:tr>
+        <w:trPr>
+          <w:trHeight w:val="482" w:hRule="atLeast"/>
+        </w:trPr>
+        <w:tc>
+          <w:tcPr>
+            <w:tcW w:type="dxa" w:w="1814"/>
+            <w:shd w:val="clear" w:color="auto" w:fill="DCF3E4"/>
+            <w:vAlign w:val="center"/>
+          </w:tcPr>
+          <w:p>
+            <w:pPr>
+              <w:spacing w:after="0"/>
+              <w:jc w:val="left"/>
+            </w:pPr>
+            <w:r/>
+            <w:r>
+              <w:drawing>
+                <wp:inline xmlns:a="http://schemas.openxmlformats.org/drawingml/2006/main" xmlns:pic="http://schemas.openxmlformats.org/drawingml/2006/picture">
+                  <wp:extent cx="270000" cy="270000"/>
+                  <wp:docPr id="8" name="Picture 8"/>
+                  <wp:cNvGraphicFramePr>
+                    <a:graphicFrameLocks noChangeAspect="1"/>
+                  </wp:cNvGraphicFramePr>
+                  <a:graphic>
+                    <a:graphicData uri="http://schemas.openxmlformats.org/drawingml/2006/picture">
+                      <pic:pic>
+                        <pic:nvPicPr>
+                          <pic:cNvPr id="0" name="nogoon.png"/>
+                          <pic:cNvPicPr/>
+                        </pic:nvPicPr>
+                        <pic:blipFill>
+                          <a:blip r:embed="rId12"/>
+                          <a:stretch>
+                            <a:fillRect/>
+                          </a:stretch>
+                        </pic:blipFill>
+                        <pic:spPr>
+                          <a:xfrm>
+                            <a:off x="0" y="0"/>
+                            <a:ext cx="270000" cy="270000"/>
+                          </a:xfrm>
+                          <a:prstGeom prst="rect"/>
+                        </pic:spPr>
+                      </pic:pic>
+                    </a:graphicData>
+                  </a:graphic>
+                </wp:inline>
+              </w:drawing>
+            </w:r>
+            <w:r>
+              <w:rPr>
+                <w:b/>
+                <w:sz w:val="18"/>
+              </w:rPr>
+              <w:t xml:space="preserve">  Ногоон</w:t>
+            </w:r>
+          </w:p>
+        </w:tc>
+        <w:tc>
+          <w:tcPr>
+            <w:tcW w:type="dxa" w:w="1077"/>
+          </w:tcPr>
+          <w:p/>
+        </w:tc>
+        <w:tc>
+          <w:tcPr>
+            <w:tcW w:type="dxa" w:w="1191"/>
+          </w:tcPr>
+          <w:p/>
+        </w:tc>
+        <w:tc>
+          <w:tcPr>
+            <w:tcW w:type="dxa" w:w="1077"/>
+          </w:tcPr>
+          <w:p/>
+        </w:tc>
+        <w:tc>
+          <w:tcPr>
+            <w:tcW w:type="dxa" w:w="1077"/>
+          </w:tcPr>
+          <w:p/>
+        </w:tc>
+        <w:tc>
+          <w:tcPr>
+            <w:tcW w:type="dxa" w:w="1077"/>
+            <w:vAlign w:val="center"/>
+          </w:tcPr>
+          <w:p>
+            <w:pPr>
+              <w:spacing w:after="0" w:before="0"/>
+              <w:jc w:val="right"/>
+            </w:pPr>
+            <w:r>
+              <w:rPr>
+                <w:b w:val="0"/>
+                <w:color w:val="999999"/>
+                <w:sz w:val="16"/>
+              </w:rPr>
+              <w:t>%</w:t>
+            </w:r>
+          </w:p>
+        </w:tc>
+        <w:tc>
+          <w:tcPr>
+            <w:tcW w:type="dxa" w:w="3458"/>
+          </w:tcPr>
+          <w:p/>
+        </w:tc>
+      </w:tr>
+      <w:tr>
+        <w:trPr>
+          <w:trHeight w:val="454" w:hRule="atLeast"/>
+        </w:trPr>
+        <w:tc>
+          <w:tcPr>
+            <w:tcW w:type="dxa" w:w="1077"/>
+            <w:gridSpan w:val="4"/>
+            <w:vAlign w:val="center"/>
+            <w:shd w:val="clear" w:color="auto" w:fill="F3F8F1"/>
+          </w:tcPr>
+          <w:p>
+            <w:pPr>
+              <w:spacing w:after="0" w:before="0"/>
+              <w:jc w:val="left"/>
+            </w:pPr>
+            <w:r/>
+            <w:r>
+              <w:rPr>
+                <w:b/>
+                <w:sz w:val="18"/>
+              </w:rPr>
+              <w:t>4 өнгийг бүгдийг таньсан хүүхдийн тоо:</w:t>
+            </w:r>
+          </w:p>
+        </w:tc>
+        <w:tc>
+          <w:tcPr>
+            <w:tcW w:type="dxa" w:w="1077"/>
+            <w:gridSpan w:val="2"/>
+            <w:vAlign w:val="center"/>
+          </w:tcPr>
+          <w:p>
+            <w:pPr>
+              <w:spacing w:after="0" w:before="0"/>
+              <w:jc w:val="center"/>
+            </w:pPr>
+            <w:r/>
+            <w:r>
+              <w:rPr>
+                <w:b w:val="0"/>
+                <w:sz w:val="18"/>
+              </w:rPr>
+              <w:t>_____ хүүхэд  (____ %)</w:t>
+            </w:r>
+          </w:p>
+        </w:tc>
+        <w:tc>
+          <w:tcPr>
+            <w:tcW w:type="dxa" w:w="3458"/>
+          </w:tcPr>
+          <w:p/>
+        </w:tc>
+      </w:tr>
+      <w:tr>
+        <w:trPr>
+          <w:trHeight w:val="454" w:hRule="atLeast"/>
+        </w:trPr>
+        <w:tc>
+          <w:tcPr>
+            <w:tcW w:type="dxa" w:w="1077"/>
+            <w:gridSpan w:val="4"/>
+            <w:vAlign w:val="center"/>
+            <w:shd w:val="clear" w:color="auto" w:fill="F3F8F1"/>
+          </w:tcPr>
+          <w:p>
+            <w:pPr>
+              <w:spacing w:after="0" w:before="0"/>
+              <w:jc w:val="left"/>
+            </w:pPr>
+            <w:r/>
+            <w:r>
+              <w:rPr>
+                <w:b/>
+                <w:sz w:val="18"/>
+              </w:rPr>
+              <w:t>Нэг ч өнгө таниагүй хүүхдийн тоо:</w:t>
+            </w:r>
+          </w:p>
+        </w:tc>
+        <w:tc>
+          <w:tcPr>
+            <w:tcW w:type="dxa" w:w="1077"/>
+            <w:gridSpan w:val="2"/>
+            <w:vAlign w:val="center"/>
+          </w:tcPr>
+          <w:p>
+            <w:pPr>
+              <w:spacing w:after="0" w:before="0"/>
+              <w:jc w:val="center"/>
+            </w:pPr>
+            <w:r/>
+            <w:r>
+              <w:rPr>
+                <w:b w:val="0"/>
+                <w:sz w:val="18"/>
+              </w:rPr>
+              <w:t>_____ хүүхэд  (____ %)</w:t>
+            </w:r>
+          </w:p>
+        </w:tc>
+        <w:tc>
+          <w:tcPr>
+            <w:tcW w:type="dxa" w:w="3458"/>
+          </w:tcPr>
+          <w:p/>
+        </w:tc>
+      </w:tr>
+    </w:tbl>
+    <w:p>
+      <w:pPr>
+        <w:spacing w:after="0" w:before="80"/>
+        <w:jc w:val="left"/>
+      </w:pPr>
+      <w:r>
+        <w:rPr>
+          <w:b w:val="0"/>
+          <w:sz w:val="16"/>
+        </w:rPr>
+        <w:t>Таньсан хувь = ✔ тоо ÷ ажигласан хүүхэд × 100.        Бөглөсөн: ______________________  (гарын үсэг)</w:t>
       </w:r>
     </w:p>
     <w:sectPr>
-      <w:pgSz w:w="16838" w:h="11906" w:orient="landscape"/>
-      <w:pgMar w:top="567" w:right="680" w:bottom="567" w:left="680" w:header="720" w:footer="720" w:gutter="0"/>
+      <w:pgSz w:w="11906" w:h="16838"/>
+      <w:pgMar w:top="510" w:right="567" w:bottom="510" w:left="567" w:header="720" w:footer="720" w:gutter="0"/>
       <w:cols w:space="720"/>
       <w:docGrid w:linePitch="360"/>
     </w:sectPr>

</xml_diff>